<commit_message>
Mesures : V6 rejoué sur le poste de THIOMBIANO (1/114 perdue, 1,74 s)
</commit_message>
<xml_diff>
--- a/docs/dossier_architecture.docx
+++ b/docs/dossier_architecture.docx
@@ -7798,13 +7798,13 @@
                 <w:b/>
                 <w:bCs/>
               </w:rPr>
-              <w:t xml:space="preserve">Application finale : 1 requête perdue sur 124, interruption réelle 1,70 s.</w:t>
-            </w:r>
-            <w:r>
-              <w:t xml:space="preserve"> </w:t>
-            </w:r>
-            <w:r>
-              <w:t xml:space="preserve">Application de test : 1/122 en 1,73 s, 1/130 en 1,68 s</w:t>
+              <w:t xml:space="preserve">Application finale : 1 requête perdue sur 124, interruption réelle 1,70 s</w:t>
+            </w:r>
+            <w:r>
+              <w:t xml:space="preserve"> </w:t>
+            </w:r>
+            <w:r>
+              <w:t xml:space="preserve">; rejoué sur le poste de THIOMBIANO : 1/114 en 1,74 s. Application de test : 1/122 en 1,73 s, 1/130 en 1,68 s</w:t>
             </w:r>
           </w:p>
         </w:tc>
@@ -7819,6 +7819,18 @@
                 <w:rStyle w:val="VerbatimChar"/>
               </w:rPr>
               <w:t xml:space="preserve">v6_20261023_163244.log</w:t>
+            </w:r>
+            <w:r>
+              <w:t xml:space="preserve">,</w:t>
+            </w:r>
+            <w:r>
+              <w:t xml:space="preserve"> </w:t>
+            </w:r>
+            <w:r>
+              <w:rPr>
+                <w:rStyle w:val="VerbatimChar"/>
+              </w:rPr>
+              <w:t xml:space="preserve">v6_20261024_182157.log</w:t>
             </w:r>
             <w:r>
               <w:t xml:space="preserve">,</w:t>

</xml_diff>

<commit_message>
Rendu : livrables finalisés et fiche de démonstration
- dossier et journal : en-tête de rendu (université, module, enseignant,
  groupe, date), notes de travail internes retirées ; régénérés en Word
  et exportés en PDF (dossier 15 pages, journal 2 pages)
- docs/DEMONSTRATION.md : préparation, commandes et remise en état pour
  chaque scénario, questions probables
- suivi : état final, ce qu'il faut envoyer, rotation d'OUEDRAOGO à faire
- installation et journal : installation de Grafana et port 8080 occupé
</commit_message>
<xml_diff>
--- a/docs/dossier_architecture.docx
+++ b/docs/dossier_architecture.docx
@@ -4,71 +4,80 @@
   <w:body>
     <w:p>
       <w:pPr>
-        <w:pStyle w:val="Titre1"/>
-      </w:pPr>
-      <w:bookmarkStart w:id="9" w:name="_abc0a87ce416bec24fbf2a2c4b5802ebd24c6be"/>
-      <w:r>
-        <w:t xml:space="preserve">Dossier d’architecture : RÉSULTATS-BF</w:t>
-      </w:r>
-      <w:bookmarkEnd w:id="9"/>
+        <w:pStyle w:val="Titre"/>
+      </w:pPr>
+      <w:r>
+        <w:t xml:space="preserve">RÉSULTATS-BF</w:t>
+      </w:r>
     </w:p>
     <w:p>
       <w:pPr>
-        <w:pStyle w:val="Normalcentr"/>
-      </w:pPr>
-      <w:r>
-        <w:t xml:space="preserve">Livrable L2, 10 à 15 pages. Assemblage : THIOMBIANO. Chaque section indique son rédacteur.</w:t>
-      </w:r>
-      <w:r>
-        <w:t xml:space="preserve"> </w:t>
-      </w:r>
-      <w:r>
-        <w:t xml:space="preserve">Conversion pour le rendu, depuis la racine du dépôt (14 pages, modèle de mise en page</w:t>
-      </w:r>
-      <w:r>
-        <w:t xml:space="preserve"> </w:t>
-      </w:r>
-      <w:r>
-        <w:rPr>
-          <w:rStyle w:val="VerbatimChar"/>
-        </w:rPr>
-        <w:t xml:space="preserve">docs/modele_word.docx</w:t>
-      </w:r>
-      <w:r>
-        <w:t xml:space="preserve">) :</w:t>
-      </w:r>
-      <w:r>
-        <w:t xml:space="preserve"> </w:t>
-      </w:r>
-      <w:r>
-        <w:rPr>
-          <w:rStyle w:val="VerbatimChar"/>
-        </w:rPr>
-        <w:t xml:space="preserve">pandoc docs/dossier_architecture.md --resource-path=docs --reference-doc docs/modele_word.docx -o docs/dossier_architecture.docx</w:t>
+        <w:pStyle w:val="Sous-titre"/>
+      </w:pPr>
+      <w:r>
+        <w:t xml:space="preserve">Dossier d’architecture : une infrastructure résiliente et scalable, entièrement décrite en code avec Vagrant</w:t>
       </w:r>
     </w:p>
     <w:p>
       <w:pPr>
+        <w:pStyle w:val="Author"/>
+      </w:pPr>
+      <w:r>
+        <w:t xml:space="preserve">Groupe 04 : KOBENDE Pêgdwendé Evrard, PORGO Abdoul Nassirou, OUEDRAOGO Armand Hendrix, THIOMBIANO Yempabou Romaric Johan</w:t>
+      </w:r>
+    </w:p>
+    <w:p>
+      <w:pPr>
+        <w:pStyle w:val="Date"/>
+      </w:pPr>
+      <w:r>
+        <w:t xml:space="preserve">Université Joseph Ki-Zerbo, IBAM · M1 Informatique · Virtualisation et Cloud Computing · Enseignant : Dr SOMDA · 26 octobre 2026</w:t>
+      </w:r>
+    </w:p>
+    <w:p>
+      <w:pPr>
         <w:pStyle w:val="FirstParagraph"/>
       </w:pPr>
       <w:r>
-        <w:rPr>
-          <w:b/>
-          <w:bCs/>
-        </w:rPr>
-        <w:t xml:space="preserve">Groupe 04 (réseau 192.168.59.0/24) — Membres :</w:t>
-      </w:r>
-      <w:r>
-        <w:t xml:space="preserve"> </w:t>
-      </w:r>
-      <w:r>
-        <w:t xml:space="preserve">KOBENDE Pêgdwendé Evrard, PORGO Abdoul Nassirou,</w:t>
-      </w:r>
-      <w:r>
-        <w:t xml:space="preserve"> </w:t>
-      </w:r>
-      <w:r>
-        <w:t xml:space="preserve">OUEDRAOGO Armand Hendrix, THIOMBIANO Yempabou Romaric Johan</w:t>
+        <w:t xml:space="preserve">Dépôt :</w:t>
+      </w:r>
+      <w:r>
+        <w:t xml:space="preserve"> </w:t>
+      </w:r>
+      <w:hyperlink r:id="rId9">
+        <w:r>
+          <w:rPr>
+            <w:rStyle w:val="Lienhypertexte"/>
+          </w:rPr>
+          <w:t xml:space="preserve">https://github.com/PorgoAbdoulNassirou/Projet-Virtualisation-Cloud</w:t>
+        </w:r>
+      </w:hyperlink>
+      <w:r>
+        <w:t xml:space="preserve">. Réseau du groupe :</w:t>
+      </w:r>
+      <w:r>
+        <w:t xml:space="preserve"> </w:t>
+      </w:r>
+      <w:r>
+        <w:rPr>
+          <w:rStyle w:val="VerbatimChar"/>
+        </w:rPr>
+        <w:t xml:space="preserve">192.168.59.0/24</w:t>
+      </w:r>
+      <w:r>
+        <w:t xml:space="preserve">. Chaque section indique son rédacteur ; chaque chiffre renvoie à un fichier brut de</w:t>
+      </w:r>
+      <w:r>
+        <w:t xml:space="preserve"> </w:t>
+      </w:r>
+      <w:r>
+        <w:rPr>
+          <w:rStyle w:val="VerbatimChar"/>
+        </w:rPr>
+        <w:t xml:space="preserve">tests/resultats/</w:t>
+      </w:r>
+      <w:r>
+        <w:t xml:space="preserve">.</w:t>
       </w:r>
     </w:p>
     <w:p>
@@ -78,15 +87,14 @@
         </w:pict>
       </w:r>
     </w:p>
+    <w:bookmarkStart w:id="10" w:name="contexte-et-exigences-thiombiano"/>
     <w:p>
       <w:pPr>
         <w:pStyle w:val="Titre2"/>
       </w:pPr>
-      <w:bookmarkStart w:id="10" w:name="_1a159fe3a67e88b88616ddc4dbd4719992f658f"/>
       <w:r>
         <w:t xml:space="preserve">1. Contexte et exigences (THIOMBIANO)</w:t>
       </w:r>
-      <w:bookmarkEnd w:id="10"/>
     </w:p>
     <w:p>
       <w:pPr>
@@ -403,7 +411,7 @@
     </w:tbl>
     <w:p>
       <w:pPr>
-        <w:pStyle w:val="FirstParagraph"/>
+        <w:pStyle w:val="Corpsdetexte"/>
       </w:pPr>
       <w:r>
         <w:t xml:space="preserve">S’y ajoutent les exigences de qualité : la plateforme se reconstruit</w:t>
@@ -519,25 +527,24 @@
         <w:t xml:space="preserve">que chacun peut rejouer.</w:t>
       </w:r>
     </w:p>
+    <w:bookmarkEnd w:id="10"/>
+    <w:bookmarkStart w:id="15" w:name="architecture-porgo"/>
     <w:p>
       <w:pPr>
         <w:pStyle w:val="Titre2"/>
       </w:pPr>
-      <w:bookmarkStart w:id="11" w:name="_beb8e3d6ec78e15642499d6b97255ee39d2d025"/>
       <w:r>
         <w:t xml:space="preserve">2. Architecture (PORGO)</w:t>
       </w:r>
-      <w:bookmarkEnd w:id="11"/>
     </w:p>
+    <w:bookmarkStart w:id="11" w:name="vue-densemble"/>
     <w:p>
       <w:pPr>
         <w:pStyle w:val="Titre3"/>
       </w:pPr>
-      <w:bookmarkStart w:id="12" w:name="_d2dafd5a055ee56f8e6b9a744bcef45a2064f0c"/>
       <w:r>
         <w:t xml:space="preserve">2.1 Vue d’ensemble</w:t>
       </w:r>
-      <w:bookmarkEnd w:id="12"/>
     </w:p>
     <w:p>
       <w:pPr>
@@ -1096,453 +1103,453 @@
     </w:tbl>
     <w:p>
       <w:pPr>
-        <w:pStyle w:val="FirstParagraph"/>
+        <w:pStyle w:val="Corpsdetexte"/>
       </w:pPr>
       <w:r>
         <w:t xml:space="preserve">Socle obligatoire : 5 VM, 3 072 Mo. Avec E1 et E2 : 4 352 Mo.</w:t>
+      </w:r>
+    </w:p>
+    <w:bookmarkEnd w:id="11"/>
+    <w:bookmarkStart w:id="12" w:name="plan-dadressage"/>
+    <w:p>
+      <w:pPr>
+        <w:pStyle w:val="Titre3"/>
+      </w:pPr>
+      <w:r>
+        <w:t xml:space="preserve">2.2 Plan d’adressage</w:t>
       </w:r>
     </w:p>
     <w:p>
       <w:pPr>
+        <w:pStyle w:val="FirstParagraph"/>
+      </w:pPr>
+      <w:r>
+        <w:t xml:space="preserve">Depuis VirtualBox 6.1.28, les réseaux hôte-seul ne sont autorisés par défaut que dans</w:t>
+      </w:r>
+      <w:r>
+        <w:t xml:space="preserve"> </w:t>
+      </w:r>
+      <w:r>
+        <w:rPr>
+          <w:rStyle w:val="VerbatimChar"/>
+        </w:rPr>
+        <w:t xml:space="preserve">192.168.56.0/21</w:t>
+      </w:r>
+      <w:r>
+        <w:t xml:space="preserve">. Le groupe 04 utilise donc</w:t>
+      </w:r>
+      <w:r>
+        <w:t xml:space="preserve"> </w:t>
+      </w:r>
+      <w:r>
+        <w:rPr>
+          <w:rStyle w:val="VerbatimChar"/>
+        </w:rPr>
+        <w:t xml:space="preserve">192.168.(55+4).0/24 = 192.168.59.0/24</w:t>
+      </w:r>
+      <w:r>
+        <w:t xml:space="preserve">, sans toucher</w:t>
+      </w:r>
+      <w:r>
+        <w:t xml:space="preserve"> </w:t>
+      </w:r>
+      <w:r>
+        <w:t xml:space="preserve">à</w:t>
+      </w:r>
+      <w:r>
+        <w:t xml:space="preserve"> </w:t>
+      </w:r>
+      <w:r>
+        <w:rPr>
+          <w:rStyle w:val="VerbatimChar"/>
+        </w:rPr>
+        <w:t xml:space="preserve">/etc/vbox/networks.conf</w:t>
+      </w:r>
+      <w:r>
+        <w:t xml:space="preserve"> </w:t>
+      </w:r>
+      <w:r>
+        <w:t xml:space="preserve">(ce qui rendrait le dépôt non reproductible). Les dizaines codent le rôle :</w:t>
+      </w:r>
+      <w:r>
+        <w:t xml:space="preserve"> </w:t>
+      </w:r>
+      <w:r>
+        <w:rPr>
+          <w:rStyle w:val="VerbatimChar"/>
+        </w:rPr>
+        <w:t xml:space="preserve">.1x</w:t>
+      </w:r>
+      <w:r>
+        <w:t xml:space="preserve"> </w:t>
+      </w:r>
+      <w:r>
+        <w:t xml:space="preserve">répartition,</w:t>
+      </w:r>
+      <w:r>
+        <w:t xml:space="preserve"> </w:t>
+      </w:r>
+      <w:r>
+        <w:rPr>
+          <w:rStyle w:val="VerbatimChar"/>
+        </w:rPr>
+        <w:t xml:space="preserve">.2x</w:t>
+      </w:r>
+      <w:r>
+        <w:t xml:space="preserve"> </w:t>
+      </w:r>
+      <w:r>
+        <w:t xml:space="preserve">applications,</w:t>
+      </w:r>
+      <w:r>
+        <w:t xml:space="preserve"> </w:t>
+      </w:r>
+      <w:r>
+        <w:rPr>
+          <w:rStyle w:val="VerbatimChar"/>
+        </w:rPr>
+        <w:t xml:space="preserve">.3x</w:t>
+      </w:r>
+      <w:r>
+        <w:t xml:space="preserve"> </w:t>
+      </w:r>
+      <w:r>
+        <w:t xml:space="preserve">données,</w:t>
+      </w:r>
+      <w:r>
+        <w:t xml:space="preserve"> </w:t>
+      </w:r>
+      <w:r>
+        <w:rPr>
+          <w:rStyle w:val="VerbatimChar"/>
+        </w:rPr>
+        <w:t xml:space="preserve">.4x</w:t>
+      </w:r>
+      <w:r>
+        <w:t xml:space="preserve"> </w:t>
+      </w:r>
+      <w:r>
+        <w:t xml:space="preserve">supervision,</w:t>
+      </w:r>
+      <w:r>
+        <w:t xml:space="preserve"> </w:t>
+      </w:r>
+      <w:r>
+        <w:rPr>
+          <w:rStyle w:val="VerbatimChar"/>
+        </w:rPr>
+        <w:t xml:space="preserve">.5</w:t>
+      </w:r>
+      <w:r>
+        <w:t xml:space="preserve"> </w:t>
+      </w:r>
+      <w:r>
+        <w:t xml:space="preserve">IP virtuelle.</w:t>
+      </w:r>
+      <w:r>
+        <w:t xml:space="preserve"> </w:t>
+      </w:r>
+      <w:r>
+        <w:rPr>
+          <w:rStyle w:val="VerbatimChar"/>
+        </w:rPr>
+        <w:t xml:space="preserve">NB_APP</w:t>
+      </w:r>
+      <w:r>
+        <w:t xml:space="preserve"> </w:t>
+      </w:r>
+      <w:r>
+        <w:t xml:space="preserve">est donc borné à 9 (</w:t>
+      </w:r>
+      <w:r>
+        <w:rPr>
+          <w:rStyle w:val="VerbatimChar"/>
+        </w:rPr>
+        <w:t xml:space="preserve">.21</w:t>
+      </w:r>
+      <w:r>
+        <w:t xml:space="preserve"> </w:t>
+      </w:r>
+      <w:r>
+        <w:t xml:space="preserve">à</w:t>
+      </w:r>
+      <w:r>
+        <w:t xml:space="preserve"> </w:t>
+      </w:r>
+      <w:r>
+        <w:rPr>
+          <w:rStyle w:val="VerbatimChar"/>
+        </w:rPr>
+        <w:t xml:space="preserve">.29</w:t>
+      </w:r>
+      <w:r>
+        <w:t xml:space="preserve">) pour ne jamais empiéter sur les bases.</w:t>
+      </w:r>
+    </w:p>
+    <w:bookmarkEnd w:id="12"/>
+    <w:bookmarkStart w:id="13" w:name="source-unique-de-vérité-r3"/>
+    <w:p>
+      <w:pPr>
         <w:pStyle w:val="Titre3"/>
       </w:pPr>
-      <w:bookmarkStart w:id="13" w:name="_147b1167e1af767e2e191c70bfd928c869bfe7c"/>
-      <w:r>
-        <w:t xml:space="preserve">2.2 Plan d’adressage</w:t>
-      </w:r>
-      <w:bookmarkEnd w:id="13"/>
+      <w:r>
+        <w:t xml:space="preserve">2.3 Source unique de vérité (R3)</w:t>
+      </w:r>
     </w:p>
     <w:p>
       <w:pPr>
         <w:pStyle w:val="FirstParagraph"/>
       </w:pPr>
       <w:r>
-        <w:t xml:space="preserve">Depuis VirtualBox 6.1.28, les réseaux hôte-seul ne sont autorisés par défaut que dans</w:t>
-      </w:r>
-      <w:r>
-        <w:t xml:space="preserve"> </w:t>
-      </w:r>
-      <w:r>
-        <w:rPr>
-          <w:rStyle w:val="VerbatimChar"/>
-        </w:rPr>
-        <w:t xml:space="preserve">192.168.56.0/21</w:t>
-      </w:r>
-      <w:r>
-        <w:t xml:space="preserve">. Le groupe 04 utilise donc</w:t>
-      </w:r>
-      <w:r>
-        <w:t xml:space="preserve"> </w:t>
-      </w:r>
-      <w:r>
-        <w:rPr>
-          <w:rStyle w:val="VerbatimChar"/>
-        </w:rPr>
-        <w:t xml:space="preserve">192.168.(55+4).0/24 = 192.168.59.0/24</w:t>
-      </w:r>
-      <w:r>
-        <w:t xml:space="preserve">, sans toucher</w:t>
-      </w:r>
-      <w:r>
-        <w:t xml:space="preserve"> </w:t>
-      </w:r>
-      <w:r>
-        <w:t xml:space="preserve">à</w:t>
-      </w:r>
-      <w:r>
-        <w:t xml:space="preserve"> </w:t>
-      </w:r>
-      <w:r>
-        <w:rPr>
-          <w:rStyle w:val="VerbatimChar"/>
-        </w:rPr>
-        <w:t xml:space="preserve">/etc/vbox/networks.conf</w:t>
-      </w:r>
-      <w:r>
-        <w:t xml:space="preserve"> </w:t>
-      </w:r>
-      <w:r>
-        <w:t xml:space="preserve">(ce qui rendrait le dépôt non reproductible). Les dizaines codent le rôle :</w:t>
-      </w:r>
-      <w:r>
-        <w:t xml:space="preserve"> </w:t>
-      </w:r>
-      <w:r>
-        <w:rPr>
-          <w:rStyle w:val="VerbatimChar"/>
-        </w:rPr>
-        <w:t xml:space="preserve">.1x</w:t>
-      </w:r>
-      <w:r>
-        <w:t xml:space="preserve"> </w:t>
-      </w:r>
-      <w:r>
-        <w:t xml:space="preserve">répartition,</w:t>
-      </w:r>
-      <w:r>
-        <w:t xml:space="preserve"> </w:t>
-      </w:r>
-      <w:r>
-        <w:rPr>
-          <w:rStyle w:val="VerbatimChar"/>
-        </w:rPr>
-        <w:t xml:space="preserve">.2x</w:t>
-      </w:r>
-      <w:r>
-        <w:t xml:space="preserve"> </w:t>
-      </w:r>
-      <w:r>
-        <w:t xml:space="preserve">applications,</w:t>
-      </w:r>
-      <w:r>
-        <w:t xml:space="preserve"> </w:t>
-      </w:r>
-      <w:r>
-        <w:rPr>
-          <w:rStyle w:val="VerbatimChar"/>
-        </w:rPr>
-        <w:t xml:space="preserve">.3x</w:t>
-      </w:r>
-      <w:r>
-        <w:t xml:space="preserve"> </w:t>
-      </w:r>
-      <w:r>
-        <w:t xml:space="preserve">données,</w:t>
-      </w:r>
-      <w:r>
-        <w:t xml:space="preserve"> </w:t>
-      </w:r>
-      <w:r>
-        <w:rPr>
-          <w:rStyle w:val="VerbatimChar"/>
-        </w:rPr>
-        <w:t xml:space="preserve">.4x</w:t>
-      </w:r>
-      <w:r>
-        <w:t xml:space="preserve"> </w:t>
-      </w:r>
-      <w:r>
-        <w:t xml:space="preserve">supervision,</w:t>
-      </w:r>
-      <w:r>
-        <w:t xml:space="preserve"> </w:t>
-      </w:r>
-      <w:r>
-        <w:rPr>
-          <w:rStyle w:val="VerbatimChar"/>
-        </w:rPr>
-        <w:t xml:space="preserve">.5</w:t>
-      </w:r>
-      <w:r>
-        <w:t xml:space="preserve"> </w:t>
-      </w:r>
-      <w:r>
-        <w:t xml:space="preserve">IP virtuelle.</w:t>
-      </w:r>
-      <w:r>
-        <w:t xml:space="preserve"> </w:t>
-      </w:r>
-      <w:r>
-        <w:rPr>
-          <w:rStyle w:val="VerbatimChar"/>
-        </w:rPr>
-        <w:t xml:space="preserve">NB_APP</w:t>
-      </w:r>
-      <w:r>
-        <w:t xml:space="preserve"> </w:t>
-      </w:r>
-      <w:r>
-        <w:t xml:space="preserve">est donc borné à 9 (</w:t>
-      </w:r>
-      <w:r>
-        <w:rPr>
-          <w:rStyle w:val="VerbatimChar"/>
-        </w:rPr>
-        <w:t xml:space="preserve">.21</w:t>
-      </w:r>
-      <w:r>
-        <w:t xml:space="preserve"> </w:t>
-      </w:r>
-      <w:r>
-        <w:t xml:space="preserve">à</w:t>
-      </w:r>
-      <w:r>
-        <w:t xml:space="preserve"> </w:t>
-      </w:r>
-      <w:r>
-        <w:rPr>
-          <w:rStyle w:val="VerbatimChar"/>
-        </w:rPr>
-        <w:t xml:space="preserve">.29</w:t>
-      </w:r>
-      <w:r>
-        <w:t xml:space="preserve">) pour ne jamais empiéter sur les bases.</w:t>
+        <w:t xml:space="preserve">La table</w:t>
+      </w:r>
+      <w:r>
+        <w:t xml:space="preserve"> </w:t>
+      </w:r>
+      <w:r>
+        <w:rPr>
+          <w:rStyle w:val="VerbatimChar"/>
+        </w:rPr>
+        <w:t xml:space="preserve">NOEUDS</w:t>
+      </w:r>
+      <w:r>
+        <w:t xml:space="preserve"> </w:t>
+      </w:r>
+      <w:r>
+        <w:t xml:space="preserve">du</w:t>
+      </w:r>
+      <w:r>
+        <w:t xml:space="preserve"> </w:t>
+      </w:r>
+      <w:r>
+        <w:rPr>
+          <w:rStyle w:val="VerbatimChar"/>
+        </w:rPr>
+        <w:t xml:space="preserve">Vagrantfile</w:t>
+      </w:r>
+      <w:r>
+        <w:t xml:space="preserve"> </w:t>
+      </w:r>
+      <w:r>
+        <w:t xml:space="preserve">est la</w:t>
+      </w:r>
+      <w:r>
+        <w:t xml:space="preserve"> </w:t>
+      </w:r>
+      <w:r>
+        <w:rPr>
+          <w:b/>
+          <w:bCs/>
+        </w:rPr>
+        <w:t xml:space="preserve">seule</w:t>
+      </w:r>
+      <w:r>
+        <w:t xml:space="preserve"> </w:t>
+      </w:r>
+      <w:r>
+        <w:t xml:space="preserve">description de l’infrastructure. À chaque commande</w:t>
+      </w:r>
+      <w:r>
+        <w:t xml:space="preserve"> </w:t>
+      </w:r>
+      <w:r>
+        <w:rPr>
+          <w:rStyle w:val="VerbatimChar"/>
+        </w:rPr>
+        <w:t xml:space="preserve">vagrant</w:t>
+      </w:r>
+      <w:r>
+        <w:t xml:space="preserve">, elle est sérialisée dans</w:t>
+      </w:r>
+      <w:r>
+        <w:t xml:space="preserve"> </w:t>
+      </w:r>
+      <w:r>
+        <w:rPr>
+          <w:rStyle w:val="VerbatimChar"/>
+        </w:rPr>
+        <w:t xml:space="preserve">config/plateforme.json</w:t>
+      </w:r>
+      <w:r>
+        <w:t xml:space="preserve"> </w:t>
+      </w:r>
+      <w:r>
+        <w:t xml:space="preserve">(et</w:t>
+      </w:r>
+      <w:r>
+        <w:t xml:space="preserve"> </w:t>
+      </w:r>
+      <w:r>
+        <w:rPr>
+          <w:rStyle w:val="VerbatimChar"/>
+        </w:rPr>
+        <w:t xml:space="preserve">config/noeuds.yml</w:t>
+      </w:r>
+      <w:r>
+        <w:t xml:space="preserve">), que les VM lisent</w:t>
+      </w:r>
+      <w:r>
+        <w:t xml:space="preserve"> </w:t>
+      </w:r>
+      <w:r>
+        <w:t xml:space="preserve">dans</w:t>
+      </w:r>
+      <w:r>
+        <w:t xml:space="preserve"> </w:t>
+      </w:r>
+      <w:r>
+        <w:rPr>
+          <w:rStyle w:val="VerbatimChar"/>
+        </w:rPr>
+        <w:t xml:space="preserve">/vagrant/config/</w:t>
+      </w:r>
+      <w:r>
+        <w:t xml:space="preserve"> </w:t>
+      </w:r>
+      <w:r>
+        <w:t xml:space="preserve">via</w:t>
+      </w:r>
+      <w:r>
+        <w:t xml:space="preserve"> </w:t>
+      </w:r>
+      <w:r>
+        <w:rPr>
+          <w:rStyle w:val="VerbatimChar"/>
+        </w:rPr>
+        <w:t xml:space="preserve">scripts/plateforme.py</w:t>
+      </w:r>
+      <w:r>
+        <w:t xml:space="preserve">. En découlent automatiquement :</w:t>
+      </w:r>
+      <w:r>
+        <w:t xml:space="preserve"> </w:t>
+      </w:r>
+      <w:r>
+        <w:t xml:space="preserve">la configuration HAProxy (liste des serveurs), keepalived (pairs VRRP, interface, IP virtuelle),</w:t>
+      </w:r>
+      <w:r>
+        <w:t xml:space="preserve"> </w:t>
+      </w:r>
+      <w:r>
+        <w:rPr>
+          <w:rStyle w:val="VerbatimChar"/>
+        </w:rPr>
+        <w:t xml:space="preserve">/etc/hosts</w:t>
+      </w:r>
+      <w:r>
+        <w:t xml:space="preserve"> </w:t>
+      </w:r>
+      <w:r>
+        <w:t xml:space="preserve">de chaque machine et les cibles Prometheus.</w:t>
+      </w:r>
+      <w:r>
+        <w:t xml:space="preserve"> </w:t>
+      </w:r>
+      <w:r>
+        <w:rPr>
+          <w:b/>
+          <w:bCs/>
+        </w:rPr>
+        <w:t xml:space="preserve">Aucune adresse n’est écrite en dur</w:t>
+      </w:r>
+      <w:r>
+        <w:t xml:space="preserve"> </w:t>
+      </w:r>
+      <w:r>
+        <w:t xml:space="preserve">dans</w:t>
+      </w:r>
+      <w:r>
+        <w:t xml:space="preserve"> </w:t>
+      </w:r>
+      <w:r>
+        <w:t xml:space="preserve">un script ou une configuration.</w:t>
+      </w:r>
+    </w:p>
+    <w:bookmarkEnd w:id="13"/>
+    <w:bookmarkStart w:id="14" w:name="cloisonnement-réseau-r8"/>
+    <w:p>
+      <w:pPr>
+        <w:pStyle w:val="Titre3"/>
+      </w:pPr>
+      <w:r>
+        <w:t xml:space="preserve">2.4 Cloisonnement réseau (R8)</w:t>
       </w:r>
     </w:p>
     <w:p>
       <w:pPr>
+        <w:pStyle w:val="FirstParagraph"/>
+      </w:pPr>
+      <w:r>
+        <w:t xml:space="preserve">Tout le trafic interne passe par le réseau privé</w:t>
+      </w:r>
+      <w:r>
+        <w:t xml:space="preserve"> </w:t>
+      </w:r>
+      <w:r>
+        <w:rPr>
+          <w:rStyle w:val="VerbatimChar"/>
+        </w:rPr>
+        <w:t xml:space="preserve">192.168.59.0/24</w:t>
+      </w:r>
+      <w:r>
+        <w:t xml:space="preserve">. Le seul port redirigé vers l’hôte est</w:t>
+      </w:r>
+      <w:r>
+        <w:t xml:space="preserve"> </w:t>
+      </w:r>
+      <w:r>
+        <w:rPr>
+          <w:rStyle w:val="VerbatimChar"/>
+        </w:rPr>
+        <w:t xml:space="preserve">127.0.0.1:8080 → lb1:80</w:t>
+      </w:r>
+      <w:r>
+        <w:t xml:space="preserve"> </w:t>
+      </w:r>
+      <w:r>
+        <w:t xml:space="preserve">(lié à la boucle locale : invisible depuis le réseau de la salle). Les ports</w:t>
+      </w:r>
+      <w:r>
+        <w:t xml:space="preserve"> </w:t>
+      </w:r>
+      <w:r>
+        <w:t xml:space="preserve">SSH (2222, 2200…) sont ceux que Vagrant ajoute pour son propre accès. La page de statistiques HAProxy</w:t>
+      </w:r>
+      <w:r>
+        <w:t xml:space="preserve"> </w:t>
+      </w:r>
+      <w:r>
+        <w:t xml:space="preserve">(</w:t>
+      </w:r>
+      <w:r>
+        <w:rPr>
+          <w:rStyle w:val="VerbatimChar"/>
+        </w:rPr>
+        <w:t xml:space="preserve">:8404</w:t>
+      </w:r>
+      <w:r>
+        <w:t xml:space="preserve">) n’écoute que sur l’IP privée du répartiteur.</w:t>
+      </w:r>
+    </w:p>
+    <w:bookmarkEnd w:id="14"/>
+    <w:bookmarkEnd w:id="15"/>
+    <w:bookmarkStart w:id="22" w:name="justification-des-choix"/>
+    <w:p>
+      <w:pPr>
+        <w:pStyle w:val="Titre2"/>
+      </w:pPr>
+      <w:r>
+        <w:t xml:space="preserve">3. Justification des choix</w:t>
+      </w:r>
+    </w:p>
+    <w:bookmarkStart w:id="16" w:name="répartition-haproxy-porgo"/>
+    <w:p>
+      <w:pPr>
         <w:pStyle w:val="Titre3"/>
       </w:pPr>
-      <w:bookmarkStart w:id="14" w:name="_cec6b4bef82a2a831793730611acd7f32b6d1dc"/>
-      <w:r>
-        <w:t xml:space="preserve">2.3 Source unique de vérité (R3)</w:t>
-      </w:r>
-      <w:bookmarkEnd w:id="14"/>
-    </w:p>
-    <w:p>
-      <w:pPr>
-        <w:pStyle w:val="FirstParagraph"/>
-      </w:pPr>
-      <w:r>
-        <w:t xml:space="preserve">La table</w:t>
-      </w:r>
-      <w:r>
-        <w:t xml:space="preserve"> </w:t>
-      </w:r>
-      <w:r>
-        <w:rPr>
-          <w:rStyle w:val="VerbatimChar"/>
-        </w:rPr>
-        <w:t xml:space="preserve">NOEUDS</w:t>
-      </w:r>
-      <w:r>
-        <w:t xml:space="preserve"> </w:t>
-      </w:r>
-      <w:r>
-        <w:t xml:space="preserve">du</w:t>
-      </w:r>
-      <w:r>
-        <w:t xml:space="preserve"> </w:t>
-      </w:r>
-      <w:r>
-        <w:rPr>
-          <w:rStyle w:val="VerbatimChar"/>
-        </w:rPr>
-        <w:t xml:space="preserve">Vagrantfile</w:t>
-      </w:r>
-      <w:r>
-        <w:t xml:space="preserve"> </w:t>
-      </w:r>
-      <w:r>
-        <w:t xml:space="preserve">est la</w:t>
-      </w:r>
-      <w:r>
-        <w:t xml:space="preserve"> </w:t>
-      </w:r>
-      <w:r>
-        <w:rPr>
-          <w:b/>
-          <w:bCs/>
-        </w:rPr>
-        <w:t xml:space="preserve">seule</w:t>
-      </w:r>
-      <w:r>
-        <w:t xml:space="preserve"> </w:t>
-      </w:r>
-      <w:r>
-        <w:t xml:space="preserve">description de l’infrastructure. À chaque commande</w:t>
-      </w:r>
-      <w:r>
-        <w:t xml:space="preserve"> </w:t>
-      </w:r>
-      <w:r>
-        <w:rPr>
-          <w:rStyle w:val="VerbatimChar"/>
-        </w:rPr>
-        <w:t xml:space="preserve">vagrant</w:t>
-      </w:r>
-      <w:r>
-        <w:t xml:space="preserve">, elle est sérialisée dans</w:t>
-      </w:r>
-      <w:r>
-        <w:t xml:space="preserve"> </w:t>
-      </w:r>
-      <w:r>
-        <w:rPr>
-          <w:rStyle w:val="VerbatimChar"/>
-        </w:rPr>
-        <w:t xml:space="preserve">config/plateforme.json</w:t>
-      </w:r>
-      <w:r>
-        <w:t xml:space="preserve"> </w:t>
-      </w:r>
-      <w:r>
-        <w:t xml:space="preserve">(et</w:t>
-      </w:r>
-      <w:r>
-        <w:t xml:space="preserve"> </w:t>
-      </w:r>
-      <w:r>
-        <w:rPr>
-          <w:rStyle w:val="VerbatimChar"/>
-        </w:rPr>
-        <w:t xml:space="preserve">config/noeuds.yml</w:t>
-      </w:r>
-      <w:r>
-        <w:t xml:space="preserve">), que les VM lisent</w:t>
-      </w:r>
-      <w:r>
-        <w:t xml:space="preserve"> </w:t>
-      </w:r>
-      <w:r>
-        <w:t xml:space="preserve">dans</w:t>
-      </w:r>
-      <w:r>
-        <w:t xml:space="preserve"> </w:t>
-      </w:r>
-      <w:r>
-        <w:rPr>
-          <w:rStyle w:val="VerbatimChar"/>
-        </w:rPr>
-        <w:t xml:space="preserve">/vagrant/config/</w:t>
-      </w:r>
-      <w:r>
-        <w:t xml:space="preserve"> </w:t>
-      </w:r>
-      <w:r>
-        <w:t xml:space="preserve">via</w:t>
-      </w:r>
-      <w:r>
-        <w:t xml:space="preserve"> </w:t>
-      </w:r>
-      <w:r>
-        <w:rPr>
-          <w:rStyle w:val="VerbatimChar"/>
-        </w:rPr>
-        <w:t xml:space="preserve">scripts/plateforme.py</w:t>
-      </w:r>
-      <w:r>
-        <w:t xml:space="preserve">. En découlent automatiquement :</w:t>
-      </w:r>
-      <w:r>
-        <w:t xml:space="preserve"> </w:t>
-      </w:r>
-      <w:r>
-        <w:t xml:space="preserve">la configuration HAProxy (liste des serveurs), keepalived (pairs VRRP, interface, IP virtuelle),</w:t>
-      </w:r>
-      <w:r>
-        <w:t xml:space="preserve"> </w:t>
-      </w:r>
-      <w:r>
-        <w:rPr>
-          <w:rStyle w:val="VerbatimChar"/>
-        </w:rPr>
-        <w:t xml:space="preserve">/etc/hosts</w:t>
-      </w:r>
-      <w:r>
-        <w:t xml:space="preserve"> </w:t>
-      </w:r>
-      <w:r>
-        <w:t xml:space="preserve">de chaque machine et les cibles Prometheus.</w:t>
-      </w:r>
-      <w:r>
-        <w:t xml:space="preserve"> </w:t>
-      </w:r>
-      <w:r>
-        <w:rPr>
-          <w:b/>
-          <w:bCs/>
-        </w:rPr>
-        <w:t xml:space="preserve">Aucune adresse n’est écrite en dur</w:t>
-      </w:r>
-      <w:r>
-        <w:t xml:space="preserve"> </w:t>
-      </w:r>
-      <w:r>
-        <w:t xml:space="preserve">dans</w:t>
-      </w:r>
-      <w:r>
-        <w:t xml:space="preserve"> </w:t>
-      </w:r>
-      <w:r>
-        <w:t xml:space="preserve">un script ou une configuration.</w:t>
-      </w:r>
-    </w:p>
-    <w:p>
-      <w:pPr>
-        <w:pStyle w:val="Titre3"/>
-      </w:pPr>
-      <w:bookmarkStart w:id="15" w:name="_f20f0cb9c732ff98fa6f90af74dc8aa959fa8f0"/>
-      <w:r>
-        <w:t xml:space="preserve">2.4 Cloisonnement réseau (R8)</w:t>
-      </w:r>
-      <w:bookmarkEnd w:id="15"/>
-    </w:p>
-    <w:p>
-      <w:pPr>
-        <w:pStyle w:val="FirstParagraph"/>
-      </w:pPr>
-      <w:r>
-        <w:t xml:space="preserve">Tout le trafic interne passe par le réseau privé</w:t>
-      </w:r>
-      <w:r>
-        <w:t xml:space="preserve"> </w:t>
-      </w:r>
-      <w:r>
-        <w:rPr>
-          <w:rStyle w:val="VerbatimChar"/>
-        </w:rPr>
-        <w:t xml:space="preserve">192.168.59.0/24</w:t>
-      </w:r>
-      <w:r>
-        <w:t xml:space="preserve">. Le seul port redirigé vers l’hôte est</w:t>
-      </w:r>
-      <w:r>
-        <w:t xml:space="preserve"> </w:t>
-      </w:r>
-      <w:r>
-        <w:rPr>
-          <w:rStyle w:val="VerbatimChar"/>
-        </w:rPr>
-        <w:t xml:space="preserve">127.0.0.1:8080 → lb1:80</w:t>
-      </w:r>
-      <w:r>
-        <w:t xml:space="preserve"> </w:t>
-      </w:r>
-      <w:r>
-        <w:t xml:space="preserve">(lié à la boucle locale : invisible depuis le réseau de la salle). Les ports</w:t>
-      </w:r>
-      <w:r>
-        <w:t xml:space="preserve"> </w:t>
-      </w:r>
-      <w:r>
-        <w:t xml:space="preserve">SSH (2222, 2200…) sont ceux que Vagrant ajoute pour son propre accès. La page de statistiques HAProxy</w:t>
-      </w:r>
-      <w:r>
-        <w:t xml:space="preserve"> </w:t>
-      </w:r>
-      <w:r>
-        <w:t xml:space="preserve">(</w:t>
-      </w:r>
-      <w:r>
-        <w:rPr>
-          <w:rStyle w:val="VerbatimChar"/>
-        </w:rPr>
-        <w:t xml:space="preserve">:8404</w:t>
-      </w:r>
-      <w:r>
-        <w:t xml:space="preserve">) n’écoute que sur l’IP privée du répartiteur.</w:t>
-      </w:r>
-    </w:p>
-    <w:p>
-      <w:pPr>
-        <w:pStyle w:val="Titre2"/>
-      </w:pPr>
-      <w:bookmarkStart w:id="16" w:name="_079006286c14c99617f5570ba97a3f3e1010b33"/>
-      <w:r>
-        <w:t xml:space="preserve">3. Justification des choix</w:t>
-      </w:r>
-      <w:bookmarkEnd w:id="16"/>
-    </w:p>
-    <w:p>
-      <w:pPr>
-        <w:pStyle w:val="Titre3"/>
-      </w:pPr>
-      <w:bookmarkStart w:id="17" w:name="_41ccccb81fd53843291e4ee4d7a19988ec28c0a"/>
       <w:r>
         <w:t xml:space="preserve">3.1 Répartition : HAProxy (PORGO)</w:t>
       </w:r>
-      <w:bookmarkEnd w:id="17"/>
     </w:p>
     <w:tbl>
       <w:tblPr>
@@ -1856,7 +1863,7 @@
     </w:tbl>
     <w:p>
       <w:pPr>
-        <w:pStyle w:val="FirstParagraph"/>
+        <w:pStyle w:val="Corpsdetexte"/>
       </w:pPr>
       <w:r>
         <w:rPr>
@@ -2259,11 +2266,12 @@
         <w:t xml:space="preserve">d’être installée : une erreur arrête le provisionnement au lieu de casser un répartiteur en service.</w:t>
       </w:r>
     </w:p>
+    <w:bookmarkEnd w:id="16"/>
+    <w:bookmarkStart w:id="17" w:name="Xacf5e763f884fe89c7ee4e5f6cbcf6768cf27e5"/>
     <w:p>
       <w:pPr>
         <w:pStyle w:val="Titre3"/>
       </w:pPr>
-      <w:bookmarkStart w:id="18" w:name="_acf5e763f884fe89c7ee4e5f6cbcf6768cf27e5"/>
       <w:r>
         <w:t xml:space="preserve">3.2 Application sans état, connexion multi-hôtes</w:t>
       </w:r>
@@ -2282,7 +2290,6 @@
       <w:r>
         <w:t xml:space="preserve">(KOBENDE)</w:t>
       </w:r>
-      <w:bookmarkEnd w:id="18"/>
     </w:p>
     <w:p>
       <w:pPr>
@@ -2785,7 +2792,7 @@
     </w:tbl>
     <w:p>
       <w:pPr>
-        <w:pStyle w:val="FirstParagraph"/>
+        <w:pStyle w:val="Corpsdetexte"/>
       </w:pPr>
       <w:r>
         <w:rPr>
@@ -3073,43 +3080,14 @@
         <w:t xml:space="preserve">réellement changé, ce qui rend le script idempotent (R2).</w:t>
       </w:r>
     </w:p>
+    <w:bookmarkEnd w:id="17"/>
+    <w:bookmarkStart w:id="18" w:name="X355edfa56663c9f7f146925be0306b91a8ece8e"/>
     <w:p>
       <w:pPr>
         <w:pStyle w:val="Titre3"/>
       </w:pPr>
-      <w:bookmarkStart w:id="19" w:name="_355edfa56663c9f7f146925be0306b91a8ece8e"/>
       <w:r>
         <w:t xml:space="preserve">3.3 PostgreSQL et réplication en flux, choix asynchrone et son RPO (OUEDRAOGO)</w:t>
-      </w:r>
-      <w:bookmarkEnd w:id="19"/>
-    </w:p>
-    <w:p>
-      <w:pPr>
-        <w:pStyle w:val="Normalcentr"/>
-      </w:pPr>
-      <w:r>
-        <w:t xml:space="preserve">Rédigé par PORGO à partir des scripts d’OUEDRAOGO (</w:t>
-      </w:r>
-      <w:r>
-        <w:rPr>
-          <w:rStyle w:val="VerbatimChar"/>
-        </w:rPr>
-        <w:t xml:space="preserve">bdd.sh</w:t>
-      </w:r>
-      <w:r>
-        <w:t xml:space="preserve">,</w:t>
-      </w:r>
-      <w:r>
-        <w:t xml:space="preserve"> </w:t>
-      </w:r>
-      <w:r>
-        <w:rPr>
-          <w:rStyle w:val="VerbatimChar"/>
-        </w:rPr>
-        <w:t xml:space="preserve">replique.sh</w:t>
-      </w:r>
-      <w:r>
-        <w:t xml:space="preserve">) ; à relire par OUEDRAOGO.</w:t>
       </w:r>
     </w:p>
     <w:tbl>
@@ -3681,15 +3659,15 @@
         </w:tc>
       </w:tr>
     </w:tbl>
+    <w:bookmarkEnd w:id="18"/>
+    <w:bookmarkStart w:id="19" w:name="Xdf1bd7c0b86330a9ac97e277a173959e5fe9ab0"/>
     <w:p>
       <w:pPr>
         <w:pStyle w:val="Titre3"/>
       </w:pPr>
-      <w:bookmarkStart w:id="20" w:name="_df1bd7c0b86330a9ac97e277a173959e5fe9ab0"/>
       <w:r>
         <w:t xml:space="preserve">3.4 Haute disponibilité du répartiteur : VRRP avec keepalived (PORGO)</w:t>
       </w:r>
-      <w:bookmarkEnd w:id="20"/>
     </w:p>
     <w:p>
       <w:pPr>
@@ -3971,15 +3949,15 @@
         <w:t xml:space="preserve">par la carte NAT de lb1 et disparaît avec lui.</w:t>
       </w:r>
     </w:p>
+    <w:bookmarkEnd w:id="19"/>
+    <w:bookmarkStart w:id="20" w:name="Xbcf64a937b6e219eb4ceda19bea8ab408209e4b"/>
     <w:p>
       <w:pPr>
         <w:pStyle w:val="Titre3"/>
       </w:pPr>
-      <w:bookmarkStart w:id="21" w:name="_bcf64a937b6e219eb4ceda19bea8ab408209e4b"/>
       <w:r>
         <w:t xml:space="preserve">3.5 Observabilité : Prometheus + Grafana, extension E2 (THIOMBIANO)</w:t>
       </w:r>
-      <w:bookmarkEnd w:id="21"/>
     </w:p>
     <w:p>
       <w:pPr>
@@ -4537,7 +4515,7 @@
     </w:tbl>
     <w:p>
       <w:pPr>
-        <w:pStyle w:val="FirstParagraph"/>
+        <w:pStyle w:val="Corpsdetexte"/>
       </w:pPr>
       <w:r>
         <w:rPr>
@@ -4737,15 +4715,15 @@
         <w:t xml:space="preserve">le rejeu suivant n’a rien changé (« Prometheus inchangé », « Grafana inchangé » : R2).</w:t>
       </w:r>
     </w:p>
+    <w:bookmarkEnd w:id="20"/>
+    <w:bookmarkStart w:id="21" w:name="Xc09143a0446281fea896a68b465903de93d0c50"/>
     <w:p>
       <w:pPr>
         <w:pStyle w:val="Titre3"/>
       </w:pPr>
-      <w:bookmarkStart w:id="22" w:name="_c09143a0446281fea896a68b465903de93d0c50"/>
       <w:r>
         <w:t xml:space="preserve">3.6 Points de défaillance unique supprimés, et ceux qui restent (tous)</w:t>
       </w:r>
-      <w:bookmarkEnd w:id="22"/>
     </w:p>
     <w:tbl>
       <w:tblPr>
@@ -4905,7 +4883,7 @@
     </w:tbl>
     <w:p>
       <w:pPr>
-        <w:pStyle w:val="FirstParagraph"/>
+        <w:pStyle w:val="Corpsdetexte"/>
       </w:pPr>
       <w:r>
         <w:rPr>
@@ -4955,15 +4933,16 @@
         <w:t xml:space="preserve">unique ; la machine de supervision obs (sa perte n’interrompt pas le service).</w:t>
       </w:r>
     </w:p>
+    <w:bookmarkEnd w:id="21"/>
+    <w:bookmarkEnd w:id="22"/>
+    <w:bookmarkStart w:id="23" w:name="reproductibilité-et-qualité-porgo"/>
     <w:p>
       <w:pPr>
         <w:pStyle w:val="Titre2"/>
       </w:pPr>
-      <w:bookmarkStart w:id="23" w:name="_61152258fb8824beac3a4f8649ee47b6d3c39dd"/>
       <w:r>
         <w:t xml:space="preserve">4. Reproductibilité et qualité (PORGO)</w:t>
       </w:r>
-      <w:bookmarkEnd w:id="23"/>
     </w:p>
     <w:p>
       <w:pPr>
@@ -5359,25 +5338,24 @@
         <w:t xml:space="preserve">absorbe le verrou d’unattended-upgrades au démarrage.</w:t>
       </w:r>
     </w:p>
+    <w:bookmarkEnd w:id="23"/>
+    <w:bookmarkStart w:id="28" w:name="procédures-dexploitation"/>
     <w:p>
       <w:pPr>
         <w:pStyle w:val="Titre2"/>
       </w:pPr>
-      <w:bookmarkStart w:id="24" w:name="_ea15b0f55896d691db7ebd724c490e3eab10616"/>
       <w:r>
         <w:t xml:space="preserve">5. Procédures d’exploitation</w:t>
       </w:r>
-      <w:bookmarkEnd w:id="24"/>
     </w:p>
+    <w:bookmarkStart w:id="24" w:name="Xfe1ed525563abca9829617b1e2193e45a1bf257"/>
     <w:p>
       <w:pPr>
         <w:pStyle w:val="Titre3"/>
       </w:pPr>
-      <w:bookmarkStart w:id="25" w:name="_fe1ed525563abca9829617b1e2193e45a1bf257"/>
       <w:r>
         <w:t xml:space="preserve">5.1 Ajouter (ou retirer) des serveurs applicatifs (PORGO)</w:t>
       </w:r>
-      <w:bookmarkEnd w:id="25"/>
     </w:p>
     <w:p>
       <w:pPr>
@@ -5573,11 +5551,12 @@
         <w:t xml:space="preserve">Les deux sens ont été exécutés (§ 6).</w:t>
       </w:r>
     </w:p>
+    <w:bookmarkEnd w:id="24"/>
+    <w:bookmarkStart w:id="25" w:name="X65feef6a7e78fd48fa0f9525805f405794a8936"/>
     <w:p>
       <w:pPr>
         <w:pStyle w:val="Titre3"/>
       </w:pPr>
-      <w:bookmarkStart w:id="26" w:name="_65feef6a7e78fd48fa0f9525805f405794a8936"/>
       <w:r>
         <w:t xml:space="preserve">5.2 Bascule de la base :</w:t>
       </w:r>
@@ -5592,15 +5571,6 @@
       </w:r>
       <w:r>
         <w:t xml:space="preserve">, étapes et durée (OUEDRAOGO)</w:t>
-      </w:r>
-      <w:bookmarkEnd w:id="26"/>
-    </w:p>
-    <w:p>
-      <w:pPr>
-        <w:pStyle w:val="Normalcentr"/>
-      </w:pPr>
-      <w:r>
-        <w:t xml:space="preserve">Rédigé par PORGO à partir du script d’OUEDRAOGO et des mesures ; à relire par OUEDRAOGO.</w:t>
       </w:r>
     </w:p>
     <w:p>
@@ -6184,7 +6154,7 @@
     </w:tbl>
     <w:p>
       <w:pPr>
-        <w:pStyle w:val="FirstParagraph"/>
+        <w:pStyle w:val="Corpsdetexte"/>
       </w:pPr>
       <w:r>
         <w:rPr>
@@ -6200,15 +6170,15 @@
         <w:t xml:space="preserve">: remettre bdd1 en service (§ 5.3).</w:t>
       </w:r>
     </w:p>
+    <w:bookmarkEnd w:id="25"/>
+    <w:bookmarkStart w:id="26" w:name="X1dbae9cc45e0fc3cd50e989a9af2af95fbf79f8"/>
     <w:p>
       <w:pPr>
         <w:pStyle w:val="Titre3"/>
       </w:pPr>
-      <w:bookmarkStart w:id="27" w:name="_1dbae9cc45e0fc3cd50e989a9af2af95fbf79f8"/>
       <w:r>
         <w:t xml:space="preserve">5.3 Remise en service de bdd1 comme nouvelle réplique (PORGO, pour OUEDRAOGO)</w:t>
       </w:r>
-      <w:bookmarkEnd w:id="27"/>
     </w:p>
     <w:p>
       <w:pPr>
@@ -6916,7 +6886,7 @@
     </w:tbl>
     <w:p>
       <w:pPr>
-        <w:pStyle w:val="FirstParagraph"/>
+        <w:pStyle w:val="Corpsdetexte"/>
       </w:pPr>
       <w:r>
         <w:rPr>
@@ -7003,15 +6973,15 @@
         <w:t xml:space="preserve">démarrer, ce qui fermerait la fenêtre.</w:t>
       </w:r>
     </w:p>
+    <w:bookmarkEnd w:id="26"/>
+    <w:bookmarkStart w:id="27" w:name="panne-et-retour-dun-répartiteur-porgo"/>
     <w:p>
       <w:pPr>
         <w:pStyle w:val="Titre3"/>
       </w:pPr>
-      <w:bookmarkStart w:id="28" w:name="_78f61231308edc17e27bc8881b70b3ea78a8a3a"/>
       <w:r>
         <w:t xml:space="preserve">5.4 Panne et retour d’un répartiteur (PORGO)</w:t>
       </w:r>
-      <w:bookmarkEnd w:id="28"/>
     </w:p>
     <w:p>
       <w:pPr>
@@ -7188,15 +7158,16 @@
         <w:t xml:space="preserve">reprend l’IP.</w:t>
       </w:r>
     </w:p>
+    <w:bookmarkEnd w:id="27"/>
+    <w:bookmarkEnd w:id="28"/>
+    <w:bookmarkStart w:id="44" w:name="X93f0ff22df11f306c53f1559252f546d566b66d"/>
     <w:p>
       <w:pPr>
         <w:pStyle w:val="Titre2"/>
       </w:pPr>
-      <w:bookmarkStart w:id="29" w:name="_93f0ff22df11f306c53f1559252f546d566b66d"/>
       <w:r>
         <w:t xml:space="preserve">6. Résultats des scénarios (THIOMBIANO + responsables)</w:t>
       </w:r>
-      <w:bookmarkEnd w:id="29"/>
     </w:p>
     <w:p>
       <w:pPr>
@@ -7860,15 +7831,14 @@
         </w:tc>
       </w:tr>
     </w:tbl>
+    <w:bookmarkStart w:id="29" w:name="v1-répartition-thiombiano"/>
     <w:p>
       <w:pPr>
         <w:pStyle w:val="Titre3"/>
       </w:pPr>
-      <w:bookmarkStart w:id="30" w:name="_d183eb4b645a6d86a5c74f1e32b8f4b6f27f16e"/>
       <w:r>
         <w:t xml:space="preserve">6.1 V1 : répartition (THIOMBIANO)</w:t>
       </w:r>
-      <w:bookmarkEnd w:id="30"/>
     </w:p>
     <w:p>
       <w:pPr>
@@ -8144,7 +8114,7 @@
     </w:tbl>
     <w:p>
       <w:pPr>
-        <w:pStyle w:val="FirstParagraph"/>
+        <w:pStyle w:val="Corpsdetexte"/>
       </w:pPr>
       <w:r>
         <w:rPr>
@@ -8218,15 +8188,15 @@
         <w:t xml:space="preserve">: page de statistiques HAProxy, 4 serveurs UP, 5 sessions chacun.</w:t>
       </w:r>
     </w:p>
+    <w:bookmarkEnd w:id="29"/>
+    <w:bookmarkStart w:id="33" w:name="Xefe04c05b3df8511ba20e0a7731ca46dcb6a4ec"/>
     <w:p>
       <w:pPr>
         <w:pStyle w:val="Titre3"/>
       </w:pPr>
-      <w:bookmarkStart w:id="31" w:name="_efe04c05b3df8511ba20e0a7731ca46dcb6a4ec"/>
       <w:r>
         <w:t xml:space="preserve">6.2 V2 : panne d’un serveur applicatif (KOBENDE, mesures PORGO et THIOMBIANO)</w:t>
       </w:r>
-      <w:bookmarkEnd w:id="31"/>
     </w:p>
     <w:p>
       <w:pPr>
@@ -8530,7 +8500,7 @@
     </w:tbl>
     <w:p>
       <w:pPr>
-        <w:pStyle w:val="FirstParagraph"/>
+        <w:pStyle w:val="Corpsdetexte"/>
       </w:pPr>
       <w:r>
         <w:rPr>
@@ -8622,18 +8592,18 @@
           <wp:inline>
             <wp:extent cx="6324600" cy="3307389"/>
             <wp:effectExtent b="0" l="0" r="0" t="0"/>
-            <wp:docPr descr="C3 : V2 vu par Grafana. app1 est écartée (DOWN, ÉTEINTE), app2 reprend tout le débit, uniquement des réponses 2xx." title="" id="33" name="Picture"/>
+            <wp:docPr descr="C3 : V2 vu par Grafana. app1 est écartée (DOWN, ÉTEINTE), app2 reprend tout le débit, uniquement des réponses 2xx." title="" id="31" name="Picture"/>
             <a:graphic>
               <a:graphicData uri="http://schemas.openxmlformats.org/drawingml/2006/picture">
                 <pic:pic>
                   <pic:nvPicPr>
-                    <pic:cNvPr descr="captures/C3_grafana_panne_app1.png" id="34" name="Picture"/>
+                    <pic:cNvPr descr="captures/C3_grafana_panne_app1.png" id="32" name="Picture"/>
                     <pic:cNvPicPr>
                       <a:picLocks noChangeArrowheads="1" noChangeAspect="1"/>
                     </pic:cNvPicPr>
                   </pic:nvPicPr>
                   <pic:blipFill>
-                    <a:blip r:embed="rId32"/>
+                    <a:blip r:embed="rId30"/>
                     <a:stretch>
                       <a:fillRect/>
                     </a:stretch>
@@ -8668,15 +8638,15 @@
         <w:t xml:space="preserve">C3 : V2 vu par Grafana. app1 est écartée (DOWN, ÉTEINTE), app2 reprend tout le débit, uniquement des réponses 2xx.</w:t>
       </w:r>
     </w:p>
+    <w:bookmarkEnd w:id="33"/>
+    <w:bookmarkStart w:id="37" w:name="X1e7cd78d0d14a0b9ebd4efa73adc111b77a1675"/>
     <w:p>
       <w:pPr>
         <w:pStyle w:val="Titre3"/>
       </w:pPr>
-      <w:bookmarkStart w:id="35" w:name="_1e7cd78d0d14a0b9ebd4efa73adc111b77a1675"/>
       <w:r>
         <w:t xml:space="preserve">6.3 V3 : montée en charge, N = 2 puis N = 4 (THIOMBIANO)</w:t>
       </w:r>
-      <w:bookmarkEnd w:id="35"/>
     </w:p>
     <w:p>
       <w:pPr>
@@ -9317,7 +9287,7 @@
     </w:tbl>
     <w:p>
       <w:pPr>
-        <w:pStyle w:val="FirstParagraph"/>
+        <w:pStyle w:val="Corpsdetexte"/>
       </w:pPr>
       <w:r>
         <w:rPr>
@@ -9596,18 +9566,18 @@
           <wp:inline>
             <wp:extent cx="6324600" cy="3306266"/>
             <wp:effectExtent b="0" l="0" r="0" t="0"/>
-            <wp:docPr descr="C5 : V3 avec N = 4. Les trois tirs, quatre serveurs à débit égal, bdd1 à 100 % de CPU (courbe rouge) et les réponses 5xx (rouge) qui accompagnent chaque tir." title="" id="37" name="Picture"/>
+            <wp:docPr descr="C5 : V3 avec N = 4. Les trois tirs, quatre serveurs à débit égal, bdd1 à 100 % de CPU (courbe rouge) et les réponses 5xx (rouge) qui accompagnent chaque tir." title="" id="35" name="Picture"/>
             <a:graphic>
               <a:graphicData uri="http://schemas.openxmlformats.org/drawingml/2006/picture">
                 <pic:pic>
                   <pic:nvPicPr>
-                    <pic:cNvPr descr="captures/C5_grafana_charge_N4.png" id="38" name="Picture"/>
+                    <pic:cNvPr descr="captures/C5_grafana_charge_N4.png" id="36" name="Picture"/>
                     <pic:cNvPicPr>
                       <a:picLocks noChangeArrowheads="1" noChangeAspect="1"/>
                     </pic:cNvPicPr>
                   </pic:nvPicPr>
                   <pic:blipFill>
-                    <a:blip r:embed="rId36"/>
+                    <a:blip r:embed="rId34"/>
                     <a:stretch>
                       <a:fillRect/>
                     </a:stretch>
@@ -9644,7 +9614,7 @@
     </w:p>
     <w:p>
       <w:pPr>
-        <w:pStyle w:val="FirstParagraph"/>
+        <w:pStyle w:val="Corpsdetexte"/>
       </w:pPr>
       <w:r>
         <w:rPr>
@@ -9722,15 +9692,15 @@
         <w:t xml:space="preserve">réplique bdd2, et des machines virtuelles réparties sur plusieurs hôtes.</w:t>
       </w:r>
     </w:p>
+    <w:bookmarkEnd w:id="37"/>
+    <w:bookmarkStart w:id="41" w:name="X1f266aed7607ef9c00b2a011e776bedd602e5da"/>
     <w:p>
       <w:pPr>
         <w:pStyle w:val="Titre3"/>
       </w:pPr>
-      <w:bookmarkStart w:id="39" w:name="_1f266aed7607ef9c00b2a011e776bedd602e5da"/>
       <w:r>
         <w:t xml:space="preserve">6.4 V4 : panne de la base primaire et bascule (OUEDRAOGO, mesure THIOMBIANO)</w:t>
       </w:r>
-      <w:bookmarkEnd w:id="39"/>
     </w:p>
     <w:p>
       <w:pPr>
@@ -10335,7 +10305,7 @@
     </w:tbl>
     <w:p>
       <w:pPr>
-        <w:pStyle w:val="FirstParagraph"/>
+        <w:pStyle w:val="Corpsdetexte"/>
       </w:pPr>
       <w:r>
         <w:rPr>
@@ -10469,18 +10439,18 @@
           <wp:inline>
             <wp:extent cx="6324600" cy="2633869"/>
             <wp:effectExtent b="0" l="0" r="0" t="0"/>
-            <wp:docPr descr="C6b : historique de disponibilité. Le bloc rouge de bdd1 (vers 16:19-16:22) est la panne V4 ; app3 et app4 disparaissent au retour à N = 2." title="" id="41" name="Picture"/>
+            <wp:docPr descr="C6b : historique de disponibilité. Le bloc rouge de bdd1 (vers 16:19-16:22) est la panne V4 ; app3 et app4 disparaissent au retour à N = 2." title="" id="39" name="Picture"/>
             <a:graphic>
               <a:graphicData uri="http://schemas.openxmlformats.org/drawingml/2006/picture">
                 <pic:pic>
                   <pic:nvPicPr>
-                    <pic:cNvPr descr="captures/C6b_grafana_panne_bdd1.png" id="42" name="Picture"/>
+                    <pic:cNvPr descr="captures/C6b_grafana_panne_bdd1.png" id="40" name="Picture"/>
                     <pic:cNvPicPr>
                       <a:picLocks noChangeArrowheads="1" noChangeAspect="1"/>
                     </pic:cNvPicPr>
                   </pic:nvPicPr>
                   <pic:blipFill>
-                    <a:blip r:embed="rId40"/>
+                    <a:blip r:embed="rId38"/>
                     <a:stretch>
                       <a:fillRect/>
                     </a:stretch>
@@ -10515,15 +10485,15 @@
         <w:t xml:space="preserve">C6b : historique de disponibilité. Le bloc rouge de bdd1 (vers 16:19-16:22) est la panne V4 ; app3 et app4 disparaissent au retour à N = 2.</w:t>
       </w:r>
     </w:p>
+    <w:bookmarkEnd w:id="41"/>
+    <w:bookmarkStart w:id="42" w:name="v5-reconstruction-intégrale-thiombiano"/>
     <w:p>
       <w:pPr>
         <w:pStyle w:val="Titre3"/>
       </w:pPr>
-      <w:bookmarkStart w:id="43" w:name="_db770031498743b96092a4e3667ab0c25cb7ca9"/>
       <w:r>
         <w:t xml:space="preserve">6.5 V5 : reconstruction intégrale (THIOMBIANO)</w:t>
       </w:r>
-      <w:bookmarkEnd w:id="43"/>
     </w:p>
     <w:p>
       <w:pPr>
@@ -10793,7 +10763,7 @@
     </w:tbl>
     <w:p>
       <w:pPr>
-        <w:pStyle w:val="FirstParagraph"/>
+        <w:pStyle w:val="Corpsdetexte"/>
       </w:pPr>
       <w:r>
         <w:rPr>
@@ -10848,15 +10818,15 @@
         <w:t xml:space="preserve">sur ce poste, sans obs mais avec le téléchargement de la box.</w:t>
       </w:r>
     </w:p>
+    <w:bookmarkEnd w:id="42"/>
+    <w:bookmarkStart w:id="43" w:name="v6-panne-du-répartiteur-porgo"/>
     <w:p>
       <w:pPr>
         <w:pStyle w:val="Titre3"/>
       </w:pPr>
-      <w:bookmarkStart w:id="44" w:name="_9ab89b54c1f6c79154a6e08cc135089cd89ca28"/>
       <w:r>
         <w:t xml:space="preserve">6.6 V6 : panne du répartiteur (PORGO)</w:t>
       </w:r>
-      <w:bookmarkEnd w:id="44"/>
     </w:p>
     <w:p>
       <w:pPr>
@@ -11825,7 +11795,7 @@
     </w:tbl>
     <w:p>
       <w:pPr>
-        <w:pStyle w:val="FirstParagraph"/>
+        <w:pStyle w:val="Corpsdetexte"/>
       </w:pPr>
       <w:r>
         <w:t xml:space="preserve">Les premières mesures (matin du 23/10) ont été faites avec une</w:t>
@@ -11930,15 +11900,16 @@
         <w:t xml:space="preserve">VirtualBox 7.2.6, Vagrant 2.4.9 ; VM Ubuntu 24.04.3 LTS (noyau 6.8), HAProxy 2.8.30, keepalived 2.2.8.</w:t>
       </w:r>
     </w:p>
+    <w:bookmarkEnd w:id="43"/>
+    <w:bookmarkEnd w:id="44"/>
+    <w:bookmarkStart w:id="45" w:name="X91bac29a6715b7f975fccd53e8f9a56645ce93f"/>
     <w:p>
       <w:pPr>
         <w:pStyle w:val="Titre2"/>
       </w:pPr>
-      <w:bookmarkStart w:id="45" w:name="_91bac29a6715b7f975fccd53e8f9a56645ce93f"/>
       <w:r>
         <w:t xml:space="preserve">7. Limites connues et ce que nous ferions autrement (tous)</w:t>
       </w:r>
-      <w:bookmarkEnd w:id="45"/>
     </w:p>
     <w:tbl>
       <w:tblPr>
@@ -12507,25 +12478,207 @@
         </w:tc>
       </w:tr>
     </w:tbl>
+    <w:bookmarkEnd w:id="45"/>
+    <w:bookmarkStart w:id="48" w:name="annexes"/>
     <w:p>
       <w:pPr>
         <w:pStyle w:val="Titre2"/>
       </w:pPr>
-      <w:bookmarkStart w:id="46" w:name="_annexes"/>
       <w:r>
         <w:t xml:space="preserve">8. Annexes</w:t>
       </w:r>
-      <w:bookmarkEnd w:id="46"/>
+    </w:p>
+    <w:bookmarkStart w:id="46" w:name="arborescence-du-dépôt"/>
+    <w:p>
+      <w:pPr>
+        <w:pStyle w:val="Titre3"/>
+      </w:pPr>
+      <w:r>
+        <w:t xml:space="preserve">8.1 Arborescence du dépôt</w:t>
+      </w:r>
     </w:p>
     <w:p>
       <w:pPr>
+        <w:pStyle w:val="SourceCode"/>
+      </w:pPr>
+      <w:r>
+        <w:rPr>
+          <w:rStyle w:val="VerbatimChar"/>
+        </w:rPr>
+        <w:t xml:space="preserve">Vagrantfile                  table NOEUDS = source unique de vérité</w:t>
+      </w:r>
+      <w:r>
+        <w:br/>
+      </w:r>
+      <w:r>
+        <w:rPr>
+          <w:rStyle w:val="VerbatimChar"/>
+        </w:rPr>
+        <w:t xml:space="preserve">.env.exemple                 modèle de configuration (le .env n'est jamais versionné)</w:t>
+      </w:r>
+      <w:r>
+        <w:br/>
+      </w:r>
+      <w:r>
+        <w:rPr>
+          <w:rStyle w:val="VerbatimChar"/>
+        </w:rPr>
+        <w:t xml:space="preserve">app/app.py                   service HTTP sans état (87 lignes)</w:t>
+      </w:r>
+      <w:r>
+        <w:br/>
+      </w:r>
+      <w:r>
+        <w:rPr>
+          <w:rStyle w:val="VerbatimChar"/>
+        </w:rPr>
+        <w:t xml:space="preserve">scripts/lib.sh               fonctions communes (apt groupé, idempotence, attente)</w:t>
+      </w:r>
+      <w:r>
+        <w:br/>
+      </w:r>
+      <w:r>
+        <w:rPr>
+          <w:rStyle w:val="VerbatimChar"/>
+        </w:rPr>
+        <w:t xml:space="preserve">scripts/plateforme.py        lecture de config/plateforme.json</w:t>
+      </w:r>
+      <w:r>
+        <w:br/>
+      </w:r>
+      <w:r>
+        <w:rPr>
+          <w:rStyle w:val="VerbatimChar"/>
+        </w:rPr>
+        <w:t xml:space="preserve">scripts/commun.sh            socle de toutes les machines</w:t>
+      </w:r>
+      <w:r>
+        <w:br/>
+      </w:r>
+      <w:r>
+        <w:rPr>
+          <w:rStyle w:val="VerbatimChar"/>
+        </w:rPr>
+        <w:t xml:space="preserve">scripts/lb.sh                HAProxy + keepalived</w:t>
+      </w:r>
+      <w:r>
+        <w:br/>
+      </w:r>
+      <w:r>
+        <w:rPr>
+          <w:rStyle w:val="VerbatimChar"/>
+        </w:rPr>
+        <w:t xml:space="preserve">scripts/generer_config_lb.py haproxy.cfg et keepalived.conf engendrés</w:t>
+      </w:r>
+      <w:r>
+        <w:br/>
+      </w:r>
+      <w:r>
+        <w:rPr>
+          <w:rStyle w:val="VerbatimChar"/>
+        </w:rPr>
+        <w:t xml:space="preserve">scripts/app.sh               déploiement du service applicatif</w:t>
+      </w:r>
+      <w:r>
+        <w:br/>
+      </w:r>
+      <w:r>
+        <w:rPr>
+          <w:rStyle w:val="VerbatimChar"/>
+        </w:rPr>
+        <w:t xml:space="preserve">scripts/bdd.sh               PostgreSQL primaire et jeu de données</w:t>
+      </w:r>
+      <w:r>
+        <w:br/>
+      </w:r>
+      <w:r>
+        <w:rPr>
+          <w:rStyle w:val="VerbatimChar"/>
+        </w:rPr>
+        <w:t xml:space="preserve">scripts/replique.sh          réplique en flux</w:t>
+      </w:r>
+      <w:r>
+        <w:br/>
+      </w:r>
+      <w:r>
+        <w:rPr>
+          <w:rStyle w:val="VerbatimChar"/>
+        </w:rPr>
+        <w:t xml:space="preserve">scripts/bascule_bdd.sh       promotion chronométrée</w:t>
+      </w:r>
+      <w:r>
+        <w:br/>
+      </w:r>
+      <w:r>
+        <w:rPr>
+          <w:rStyle w:val="VerbatimChar"/>
+        </w:rPr>
+        <w:t xml:space="preserve">scripts/reintegrer_bdd.sh    remise en service de l'ancien primaire</w:t>
+      </w:r>
+      <w:r>
+        <w:br/>
+      </w:r>
+      <w:r>
+        <w:rPr>
+          <w:rStyle w:val="VerbatimChar"/>
+        </w:rPr>
+        <w:t xml:space="preserve">scripts/obs.sh               Prometheus + Grafana (E2), cibles engendrées</w:t>
+      </w:r>
+      <w:r>
+        <w:br/>
+      </w:r>
+      <w:r>
+        <w:rPr>
+          <w:rStyle w:val="VerbatimChar"/>
+        </w:rPr>
+        <w:t xml:space="preserve">config/grafana/              source de données et tableau de bord provisionnés</w:t>
+      </w:r>
+      <w:r>
+        <w:br/>
+      </w:r>
+      <w:r>
+        <w:rPr>
+          <w:rStyle w:val="VerbatimChar"/>
+        </w:rPr>
+        <w:t xml:space="preserve">tests/v1 … v6_*.sh           scénarios V1 à V6 ; verifier_repartition.sh (R2, R3, R4, R8)</w:t>
+      </w:r>
+      <w:r>
+        <w:br/>
+      </w:r>
+      <w:r>
+        <w:rPr>
+          <w:rStyle w:val="VerbatimChar"/>
+        </w:rPr>
+        <w:t xml:space="preserve">tests/resultats/             résultats bruts horodatés (preuves des chiffres du § 6)</w:t>
+      </w:r>
+      <w:r>
+        <w:br/>
+      </w:r>
+      <w:r>
+        <w:rPr>
+          <w:rStyle w:val="VerbatimChar"/>
+        </w:rPr>
+        <w:t xml:space="preserve">docs/captures/               captures C1 à C6b citées au § 6</w:t>
+      </w:r>
+      <w:r>
+        <w:br/>
+      </w:r>
+      <w:r>
+        <w:rPr>
+          <w:rStyle w:val="VerbatimChar"/>
+        </w:rPr>
+        <w:t xml:space="preserve">docs/                        plan de travail, installation, dossier, journal</w:t>
+      </w:r>
+    </w:p>
+    <w:bookmarkEnd w:id="46"/>
+    <w:bookmarkStart w:id="47" w:name="X90bb39363478de3c6f60c83846d357367dea685"/>
+    <w:p>
+      <w:pPr>
         <w:pStyle w:val="Titre3"/>
       </w:pPr>
-      <w:bookmarkStart w:id="47" w:name="_ec2c844a01d97cf4f612dcf94e67158b2e9a7f1"/>
-      <w:r>
-        <w:t xml:space="preserve">8.1 Arborescence du dépôt</w:t>
-      </w:r>
-      <w:bookmarkEnd w:id="47"/>
+      <w:r>
+        <w:t xml:space="preserve">8.2 Extrait de la configuration HAProxy engendrée (N = 2)</w:t>
+      </w:r>
     </w:p>
     <w:p>
       <w:pPr>
@@ -12535,7 +12688,7 @@
         <w:rPr>
           <w:rStyle w:val="VerbatimChar"/>
         </w:rPr>
-        <w:t xml:space="preserve">Vagrantfile                  table NOEUDS = source unique de vérité</w:t>
+        <w:t xml:space="preserve">defaults</w:t>
       </w:r>
       <w:r>
         <w:br/>
@@ -12544,7 +12697,7 @@
         <w:rPr>
           <w:rStyle w:val="VerbatimChar"/>
         </w:rPr>
-        <w:t xml:space="preserve">.env.exemple                 modèle de configuration (le .env n'est jamais versionné)</w:t>
+        <w:t xml:space="preserve">    retries 2</w:t>
       </w:r>
       <w:r>
         <w:br/>
@@ -12553,7 +12706,7 @@
         <w:rPr>
           <w:rStyle w:val="VerbatimChar"/>
         </w:rPr>
-        <w:t xml:space="preserve">app/app.py                   service HTTP sans état (87 lignes)</w:t>
+        <w:t xml:space="preserve">    retry-on conn-failure empty-response response-timeout</w:t>
       </w:r>
       <w:r>
         <w:br/>
@@ -12562,7 +12715,7 @@
         <w:rPr>
           <w:rStyle w:val="VerbatimChar"/>
         </w:rPr>
-        <w:t xml:space="preserve">scripts/lib.sh               fonctions communes (apt groupé, idempotence, attente)</w:t>
+        <w:t xml:space="preserve">    timeout connect 1s</w:t>
       </w:r>
       <w:r>
         <w:br/>
@@ -12571,7 +12724,7 @@
         <w:rPr>
           <w:rStyle w:val="VerbatimChar"/>
         </w:rPr>
-        <w:t xml:space="preserve">scripts/plateforme.py        lecture de config/plateforme.json</w:t>
+        <w:t xml:space="preserve">    timeout check   3s</w:t>
       </w:r>
       <w:r>
         <w:br/>
@@ -12580,25 +12733,19 @@
         <w:rPr>
           <w:rStyle w:val="VerbatimChar"/>
         </w:rPr>
-        <w:t xml:space="preserve">scripts/commun.sh            socle de toutes les machines</w:t>
+        <w:t xml:space="preserve">    default-server inter 1s fastinter 500ms downinter 2s fall 2 rise 2</w:t>
       </w:r>
       <w:r>
         <w:br/>
       </w:r>
       <w:r>
-        <w:rPr>
-          <w:rStyle w:val="VerbatimChar"/>
-        </w:rPr>
-        <w:t xml:space="preserve">scripts/lb.sh                HAProxy + keepalived</w:t>
-      </w:r>
-      <w:r>
         <w:br/>
       </w:r>
       <w:r>
         <w:rPr>
           <w:rStyle w:val="VerbatimChar"/>
         </w:rPr>
-        <w:t xml:space="preserve">scripts/generer_config_lb.py haproxy.cfg et keepalived.conf engendrés</w:t>
+        <w:t xml:space="preserve">backend serveurs_applicatifs</w:t>
       </w:r>
       <w:r>
         <w:br/>
@@ -12607,7 +12754,7 @@
         <w:rPr>
           <w:rStyle w:val="VerbatimChar"/>
         </w:rPr>
-        <w:t xml:space="preserve">scripts/app.sh               déploiement du service applicatif</w:t>
+        <w:t xml:space="preserve">    balance roundrobin</w:t>
       </w:r>
       <w:r>
         <w:br/>
@@ -12616,7 +12763,7 @@
         <w:rPr>
           <w:rStyle w:val="VerbatimChar"/>
         </w:rPr>
-        <w:t xml:space="preserve">scripts/bdd.sh               PostgreSQL primaire et jeu de données</w:t>
+        <w:t xml:space="preserve">    option httpchk</w:t>
       </w:r>
       <w:r>
         <w:br/>
@@ -12625,7 +12772,7 @@
         <w:rPr>
           <w:rStyle w:val="VerbatimChar"/>
         </w:rPr>
-        <w:t xml:space="preserve">scripts/replique.sh          réplique en flux</w:t>
+        <w:t xml:space="preserve">    http-check send meth GET uri /sante</w:t>
       </w:r>
       <w:r>
         <w:br/>
@@ -12634,7 +12781,7 @@
         <w:rPr>
           <w:rStyle w:val="VerbatimChar"/>
         </w:rPr>
-        <w:t xml:space="preserve">scripts/bascule_bdd.sh       promotion chronométrée</w:t>
+        <w:t xml:space="preserve">    http-check expect status 200</w:t>
       </w:r>
       <w:r>
         <w:br/>
@@ -12643,7 +12790,7 @@
         <w:rPr>
           <w:rStyle w:val="VerbatimChar"/>
         </w:rPr>
-        <w:t xml:space="preserve">scripts/reintegrer_bdd.sh    remise en service de l'ancien primaire</w:t>
+        <w:t xml:space="preserve">    server app1 192.168.59.21:3000 check</w:t>
       </w:r>
       <w:r>
         <w:br/>
@@ -12652,242 +12799,67 @@
         <w:rPr>
           <w:rStyle w:val="VerbatimChar"/>
         </w:rPr>
-        <w:t xml:space="preserve">scripts/obs.sh               Prometheus + Grafana (E2), cibles engendrées</w:t>
-      </w:r>
-      <w:r>
-        <w:br/>
-      </w:r>
-      <w:r>
-        <w:rPr>
-          <w:rStyle w:val="VerbatimChar"/>
-        </w:rPr>
-        <w:t xml:space="preserve">config/grafana/              source de données et tableau de bord provisionnés</w:t>
-      </w:r>
-      <w:r>
-        <w:br/>
-      </w:r>
-      <w:r>
-        <w:rPr>
-          <w:rStyle w:val="VerbatimChar"/>
-        </w:rPr>
-        <w:t xml:space="preserve">tests/v1 … v6_*.sh           scénarios V1 à V6 ; verifier_repartition.sh (R2, R3, R4, R8)</w:t>
-      </w:r>
-      <w:r>
-        <w:br/>
-      </w:r>
-      <w:r>
-        <w:rPr>
-          <w:rStyle w:val="VerbatimChar"/>
-        </w:rPr>
-        <w:t xml:space="preserve">tests/resultats/             résultats bruts horodatés (preuves des chiffres du § 6)</w:t>
-      </w:r>
-      <w:r>
-        <w:br/>
-      </w:r>
-      <w:r>
-        <w:rPr>
-          <w:rStyle w:val="VerbatimChar"/>
-        </w:rPr>
-        <w:t xml:space="preserve">docs/captures/               captures C1 à C6b citées au § 6</w:t>
-      </w:r>
-      <w:r>
-        <w:br/>
-      </w:r>
-      <w:r>
-        <w:rPr>
-          <w:rStyle w:val="VerbatimChar"/>
-        </w:rPr>
-        <w:t xml:space="preserve">docs/                        plan de travail, installation, dossier, journal</w:t>
+        <w:t xml:space="preserve">    server app2 192.168.59.22:3000 check</w:t>
       </w:r>
     </w:p>
     <w:p>
       <w:pPr>
-        <w:pStyle w:val="Titre3"/>
-      </w:pPr>
-      <w:bookmarkStart w:id="48" w:name="_90bb39363478de3c6f60c83846d357367dea685"/>
-      <w:r>
-        <w:t xml:space="preserve">8.2 Extrait de la configuration HAProxy engendrée (N = 2)</w:t>
-      </w:r>
-      <w:bookmarkEnd w:id="48"/>
+        <w:pStyle w:val="FirstParagraph"/>
+      </w:pPr>
+      <w:r>
+        <w:t xml:space="preserve">Avec</w:t>
+      </w:r>
+      <w:r>
+        <w:t xml:space="preserve"> </w:t>
+      </w:r>
+      <w:r>
+        <w:rPr>
+          <w:rStyle w:val="VerbatimChar"/>
+        </w:rPr>
+        <w:t xml:space="preserve">NB_APP=4</w:t>
+      </w:r>
+      <w:r>
+        <w:t xml:space="preserve">, les lignes</w:t>
+      </w:r>
+      <w:r>
+        <w:t xml:space="preserve"> </w:t>
+      </w:r>
+      <w:r>
+        <w:rPr>
+          <w:rStyle w:val="VerbatimChar"/>
+        </w:rPr>
+        <w:t xml:space="preserve">server app3 …</w:t>
+      </w:r>
+      <w:r>
+        <w:t xml:space="preserve"> </w:t>
+      </w:r>
+      <w:r>
+        <w:t xml:space="preserve">et</w:t>
+      </w:r>
+      <w:r>
+        <w:t xml:space="preserve"> </w:t>
+      </w:r>
+      <w:r>
+        <w:rPr>
+          <w:rStyle w:val="VerbatimChar"/>
+        </w:rPr>
+        <w:t xml:space="preserve">server app4 …</w:t>
+      </w:r>
+      <w:r>
+        <w:t xml:space="preserve"> </w:t>
+      </w:r>
+      <w:r>
+        <w:t xml:space="preserve">apparaissent seules, sans autre modification.</w:t>
+      </w:r>
     </w:p>
-    <w:p>
-      <w:pPr>
-        <w:pStyle w:val="SourceCode"/>
-      </w:pPr>
-      <w:r>
-        <w:rPr>
-          <w:rStyle w:val="VerbatimChar"/>
-        </w:rPr>
-        <w:t xml:space="preserve">defaults</w:t>
-      </w:r>
-      <w:r>
-        <w:br/>
-      </w:r>
-      <w:r>
-        <w:rPr>
-          <w:rStyle w:val="VerbatimChar"/>
-        </w:rPr>
-        <w:t xml:space="preserve">    retries 2</w:t>
-      </w:r>
-      <w:r>
-        <w:br/>
-      </w:r>
-      <w:r>
-        <w:rPr>
-          <w:rStyle w:val="VerbatimChar"/>
-        </w:rPr>
-        <w:t xml:space="preserve">    retry-on conn-failure empty-response response-timeout</w:t>
-      </w:r>
-      <w:r>
-        <w:br/>
-      </w:r>
-      <w:r>
-        <w:rPr>
-          <w:rStyle w:val="VerbatimChar"/>
-        </w:rPr>
-        <w:t xml:space="preserve">    timeout connect 1s</w:t>
-      </w:r>
-      <w:r>
-        <w:br/>
-      </w:r>
-      <w:r>
-        <w:rPr>
-          <w:rStyle w:val="VerbatimChar"/>
-        </w:rPr>
-        <w:t xml:space="preserve">    timeout check   3s</w:t>
-      </w:r>
-      <w:r>
-        <w:br/>
-      </w:r>
-      <w:r>
-        <w:rPr>
-          <w:rStyle w:val="VerbatimChar"/>
-        </w:rPr>
-        <w:t xml:space="preserve">    default-server inter 1s fastinter 500ms downinter 2s fall 2 rise 2</w:t>
-      </w:r>
-      <w:r>
-        <w:br/>
-      </w:r>
-      <w:r>
-        <w:br/>
-      </w:r>
-      <w:r>
-        <w:rPr>
-          <w:rStyle w:val="VerbatimChar"/>
-        </w:rPr>
-        <w:t xml:space="preserve">backend serveurs_applicatifs</w:t>
-      </w:r>
-      <w:r>
-        <w:br/>
-      </w:r>
-      <w:r>
-        <w:rPr>
-          <w:rStyle w:val="VerbatimChar"/>
-        </w:rPr>
-        <w:t xml:space="preserve">    balance roundrobin</w:t>
-      </w:r>
-      <w:r>
-        <w:br/>
-      </w:r>
-      <w:r>
-        <w:rPr>
-          <w:rStyle w:val="VerbatimChar"/>
-        </w:rPr>
-        <w:t xml:space="preserve">    option httpchk</w:t>
-      </w:r>
-      <w:r>
-        <w:br/>
-      </w:r>
-      <w:r>
-        <w:rPr>
-          <w:rStyle w:val="VerbatimChar"/>
-        </w:rPr>
-        <w:t xml:space="preserve">    http-check send meth GET uri /sante</w:t>
-      </w:r>
-      <w:r>
-        <w:br/>
-      </w:r>
-      <w:r>
-        <w:rPr>
-          <w:rStyle w:val="VerbatimChar"/>
-        </w:rPr>
-        <w:t xml:space="preserve">    http-check expect status 200</w:t>
-      </w:r>
-      <w:r>
-        <w:br/>
-      </w:r>
-      <w:r>
-        <w:rPr>
-          <w:rStyle w:val="VerbatimChar"/>
-        </w:rPr>
-        <w:t xml:space="preserve">    server app1 192.168.59.21:3000 check</w:t>
-      </w:r>
-      <w:r>
-        <w:br/>
-      </w:r>
-      <w:r>
-        <w:rPr>
-          <w:rStyle w:val="VerbatimChar"/>
-        </w:rPr>
-        <w:t xml:space="preserve">    server app2 192.168.59.22:3000 check</w:t>
-      </w:r>
-    </w:p>
-    <w:p>
-      <w:pPr>
-        <w:pStyle w:val="FirstParagraph"/>
-      </w:pPr>
-      <w:r>
-        <w:t xml:space="preserve">Avec</w:t>
-      </w:r>
-      <w:r>
-        <w:t xml:space="preserve"> </w:t>
-      </w:r>
-      <w:r>
-        <w:rPr>
-          <w:rStyle w:val="VerbatimChar"/>
-        </w:rPr>
-        <w:t xml:space="preserve">NB_APP=4</w:t>
-      </w:r>
-      <w:r>
-        <w:t xml:space="preserve">, les lignes</w:t>
-      </w:r>
-      <w:r>
-        <w:t xml:space="preserve"> </w:t>
-      </w:r>
-      <w:r>
-        <w:rPr>
-          <w:rStyle w:val="VerbatimChar"/>
-        </w:rPr>
-        <w:t xml:space="preserve">server app3 …</w:t>
-      </w:r>
-      <w:r>
-        <w:t xml:space="preserve"> </w:t>
-      </w:r>
-      <w:r>
-        <w:t xml:space="preserve">et</w:t>
-      </w:r>
-      <w:r>
-        <w:t xml:space="preserve"> </w:t>
-      </w:r>
-      <w:r>
-        <w:rPr>
-          <w:rStyle w:val="VerbatimChar"/>
-        </w:rPr>
-        <w:t xml:space="preserve">server app4 …</w:t>
-      </w:r>
-      <w:r>
-        <w:t xml:space="preserve"> </w:t>
-      </w:r>
-      <w:r>
-        <w:t xml:space="preserve">apparaissent seules, sans autre modification.</w:t>
-      </w:r>
-    </w:p>
+    <w:bookmarkEnd w:id="47"/>
+    <w:bookmarkEnd w:id="48"/>
     <w:sectPr>
       <w:footnotePr>
         <w:numRestart w:val="eachSect"/>
       </w:footnotePr>
-      <w:pgSz w:w="12240" w:h="15840"/>
-      <w:pgMar w:top="1020" w:right="1140" w:bottom="1020" w:left="1140" w:header="720" w:footer="720" w:gutter="0"/>
+      <w:pgSz w:h="15840" w:w="12240"/>
+      <w:pgMar w:bottom="1020" w:footer="720" w:gutter="0" w:header="720" w:left="1140" w:right="1140" w:top="1020"/>
       <w:cols w:space="720"/>
       <w:docGrid w:linePitch="326"/>
     </w:sectPr>
@@ -12919,8 +12891,8 @@
 </file>
 
 <file path=word/numbering.xml><?xml version="1.0" encoding="utf-8"?>
-<w:numbering xmlns:wpc="http://schemas.microsoft.com/office/word/2010/wordprocessingCanvas" xmlns:cx="http://schemas.microsoft.com/office/drawing/2014/chartex" xmlns:cx1="http://schemas.microsoft.com/office/drawing/2015/9/8/chartex" xmlns:cx2="http://schemas.microsoft.com/office/drawing/2015/10/21/chartex" xmlns:cx3="http://schemas.microsoft.com/office/drawing/2016/5/9/chartex" xmlns:cx4="http://schemas.microsoft.com/office/drawing/2016/5/10/chartex" xmlns:cx5="http://schemas.microsoft.com/office/drawing/2016/5/11/chartex" xmlns:cx6="http://schemas.microsoft.com/office/drawing/2016/5/12/chartex" xmlns:cx7="http://schemas.microsoft.com/office/drawing/2016/5/13/chartex" xmlns:cx8="http://schemas.microsoft.com/office/drawing/2016/5/14/chartex" xmlns:mc="http://schemas.openxmlformats.org/markup-compatibility/2006" xmlns:aink="http://schemas.microsoft.com/office/drawing/2016/ink" xmlns:am3d="http://schemas.microsoft.com/office/drawing/2017/model3d" xmlns:o="urn:schemas-microsoft-com:office:office" xmlns:r="http://schemas.openxmlformats.org/officeDocument/2006/relationships" xmlns:m="http://schemas.openxmlformats.org/officeDocument/2006/math" xmlns:v="urn:schemas-microsoft-com:vml" xmlns:wp14="http://schemas.microsoft.com/office/word/2010/wordprocessingDrawing" xmlns:wp="http://schemas.openxmlformats.org/drawingml/2006/wordprocessingDrawing" xmlns:w10="urn:schemas-microsoft-com:office:word" xmlns:w="http://schemas.openxmlformats.org/wordprocessingml/2006/main" xmlns:w14="http://schemas.microsoft.com/office/word/2010/wordml" xmlns:w15="http://schemas.microsoft.com/office/word/2012/wordml" xmlns:w16cex="http://schemas.microsoft.com/office/word/2018/wordml/cex" xmlns:w16cid="http://schemas.microsoft.com/office/word/2016/wordml/cid" xmlns:w16="http://schemas.microsoft.com/office/word/2018/wordml" xmlns:w16sdtdh="http://schemas.microsoft.com/office/word/2020/wordml/sdtdatahash" xmlns:w16se="http://schemas.microsoft.com/office/word/2015/wordml/symex" xmlns:wpg="http://schemas.microsoft.com/office/word/2010/wordprocessingGroup" xmlns:wpi="http://schemas.microsoft.com/office/word/2010/wordprocessingInk" xmlns:wne="http://schemas.microsoft.com/office/word/2006/wordml" xmlns:wps="http://schemas.microsoft.com/office/word/2010/wordprocessingShape" mc:Ignorable="w14 w15 w16se w16cid w16 w16cex w16sdtdh wp14">
-  <w:abstractNum w:abstractNumId="0" w15:restartNumberingAfterBreak="0">
+<w:numbering xmlns:aink="http://schemas.microsoft.com/office/drawing/2016/ink" xmlns:am3d="http://schemas.microsoft.com/office/drawing/2017/model3d" xmlns:cx="http://schemas.microsoft.com/office/drawing/2014/chartex" xmlns:cx1="http://schemas.microsoft.com/office/drawing/2015/9/8/chartex" xmlns:cx2="http://schemas.microsoft.com/office/drawing/2015/10/21/chartex" xmlns:cx3="http://schemas.microsoft.com/office/drawing/2016/5/9/chartex" xmlns:cx4="http://schemas.microsoft.com/office/drawing/2016/5/10/chartex" xmlns:cx5="http://schemas.microsoft.com/office/drawing/2016/5/11/chartex" xmlns:cx6="http://schemas.microsoft.com/office/drawing/2016/5/12/chartex" xmlns:cx7="http://schemas.microsoft.com/office/drawing/2016/5/13/chartex" xmlns:cx8="http://schemas.microsoft.com/office/drawing/2016/5/14/chartex" xmlns:m="http://schemas.openxmlformats.org/officeDocument/2006/math" xmlns:mc="http://schemas.openxmlformats.org/markup-compatibility/2006" xmlns:o="urn:schemas-microsoft-com:office:office" xmlns:r="http://schemas.openxmlformats.org/officeDocument/2006/relationships" xmlns:v="urn:schemas-microsoft-com:vml" xmlns:w="http://schemas.openxmlformats.org/wordprocessingml/2006/main" xmlns:w10="urn:schemas-microsoft-com:office:word" xmlns:w14="http://schemas.microsoft.com/office/word/2010/wordml" xmlns:w15="http://schemas.microsoft.com/office/word/2012/wordml" xmlns:w16="http://schemas.microsoft.com/office/word/2018/wordml" xmlns:w16cex="http://schemas.microsoft.com/office/word/2018/wordml/cex" xmlns:w16cid="http://schemas.microsoft.com/office/word/2016/wordml/cid" xmlns:w16sdtdh="http://schemas.microsoft.com/office/word/2020/wordml/sdtdatahash" xmlns:w16se="http://schemas.microsoft.com/office/word/2015/wordml/symex" xmlns:wne="http://schemas.microsoft.com/office/word/2006/wordml" xmlns:wp="http://schemas.openxmlformats.org/drawingml/2006/wordprocessingDrawing" xmlns:wp14="http://schemas.microsoft.com/office/word/2010/wordprocessingDrawing" xmlns:wpc="http://schemas.microsoft.com/office/word/2010/wordprocessingCanvas" xmlns:wpg="http://schemas.microsoft.com/office/word/2010/wordprocessingGroup" xmlns:wpi="http://schemas.microsoft.com/office/word/2010/wordprocessingInk" xmlns:wps="http://schemas.microsoft.com/office/word/2010/wordprocessingShape" mc:Ignorable="w14 w15 w16se w16cid w16 w16cex w16sdtdh wp14">
+  <w:abstractNum w15:restartNumberingAfterBreak="0" w:abstractNumId="0">
     <w:nsid w:val="170CD2DE"/>
     <w:multiLevelType w:val="multilevel"/>
     <w:tmpl w:val="C55C08B4"/>
@@ -12930,9 +12902,9 @@
       <w:lvlJc w:val="left"/>
       <w:pPr>
         <w:tabs>
-          <w:tab w:val="num" w:pos="0"/>
+          <w:tab w:pos="0" w:val="num"/>
         </w:tabs>
-        <w:ind w:left="480" w:hanging="480"/>
+        <w:ind w:hanging="480" w:left="480"/>
       </w:pPr>
     </w:lvl>
     <w:lvl w:ilvl="1">
@@ -12941,9 +12913,9 @@
       <w:lvlJc w:val="left"/>
       <w:pPr>
         <w:tabs>
-          <w:tab w:val="num" w:pos="720"/>
+          <w:tab w:pos="720" w:val="num"/>
         </w:tabs>
-        <w:ind w:left="1200" w:hanging="480"/>
+        <w:ind w:hanging="480" w:left="1200"/>
       </w:pPr>
     </w:lvl>
     <w:lvl w:ilvl="2">
@@ -12952,9 +12924,9 @@
       <w:lvlJc w:val="left"/>
       <w:pPr>
         <w:tabs>
-          <w:tab w:val="num" w:pos="1440"/>
+          <w:tab w:pos="1440" w:val="num"/>
         </w:tabs>
-        <w:ind w:left="1920" w:hanging="480"/>
+        <w:ind w:hanging="480" w:left="1920"/>
       </w:pPr>
     </w:lvl>
     <w:lvl w:ilvl="3">
@@ -12963,9 +12935,9 @@
       <w:lvlJc w:val="left"/>
       <w:pPr>
         <w:tabs>
-          <w:tab w:val="num" w:pos="2160"/>
+          <w:tab w:pos="2160" w:val="num"/>
         </w:tabs>
-        <w:ind w:left="2640" w:hanging="480"/>
+        <w:ind w:hanging="480" w:left="2640"/>
       </w:pPr>
     </w:lvl>
     <w:lvl w:ilvl="4">
@@ -12974,9 +12946,9 @@
       <w:lvlJc w:val="left"/>
       <w:pPr>
         <w:tabs>
-          <w:tab w:val="num" w:pos="2880"/>
+          <w:tab w:pos="2880" w:val="num"/>
         </w:tabs>
-        <w:ind w:left="3360" w:hanging="480"/>
+        <w:ind w:hanging="480" w:left="3360"/>
       </w:pPr>
     </w:lvl>
     <w:lvl w:ilvl="5">
@@ -12985,9 +12957,9 @@
       <w:lvlJc w:val="left"/>
       <w:pPr>
         <w:tabs>
-          <w:tab w:val="num" w:pos="3600"/>
+          <w:tab w:pos="3600" w:val="num"/>
         </w:tabs>
-        <w:ind w:left="4080" w:hanging="480"/>
+        <w:ind w:hanging="480" w:left="4080"/>
       </w:pPr>
     </w:lvl>
     <w:lvl w:ilvl="6">
@@ -12996,9 +12968,9 @@
       <w:lvlJc w:val="left"/>
       <w:pPr>
         <w:tabs>
-          <w:tab w:val="num" w:pos="4320"/>
+          <w:tab w:pos="4320" w:val="num"/>
         </w:tabs>
-        <w:ind w:left="4800" w:hanging="480"/>
+        <w:ind w:hanging="480" w:left="4800"/>
       </w:pPr>
     </w:lvl>
     <w:lvl w:ilvl="7">
@@ -13007,9 +12979,9 @@
       <w:lvlJc w:val="left"/>
       <w:pPr>
         <w:tabs>
-          <w:tab w:val="num" w:pos="5040"/>
+          <w:tab w:pos="5040" w:val="num"/>
         </w:tabs>
-        <w:ind w:left="5520" w:hanging="480"/>
+        <w:ind w:hanging="480" w:left="5520"/>
       </w:pPr>
     </w:lvl>
     <w:lvl w:ilvl="8">
@@ -13018,9 +12990,9 @@
       <w:lvlJc w:val="left"/>
       <w:pPr>
         <w:tabs>
-          <w:tab w:val="num" w:pos="5760"/>
+          <w:tab w:pos="5760" w:val="num"/>
         </w:tabs>
-        <w:ind w:left="6240" w:hanging="480"/>
+        <w:ind w:hanging="480" w:left="6240"/>
       </w:pPr>
     </w:lvl>
   </w:abstractNum>
@@ -13427,14 +13399,14 @@
 </file>
 
 <file path=word/styles.xml><?xml version="1.0" encoding="utf-8"?>
-<w:styles xmlns:mc="http://schemas.openxmlformats.org/markup-compatibility/2006" xmlns:r="http://schemas.openxmlformats.org/officeDocument/2006/relationships" xmlns:w="http://schemas.openxmlformats.org/wordprocessingml/2006/main" xmlns:w14="http://schemas.microsoft.com/office/word/2010/wordml" xmlns:w15="http://schemas.microsoft.com/office/word/2012/wordml" xmlns:w16cex="http://schemas.microsoft.com/office/word/2018/wordml/cex" xmlns:w16cid="http://schemas.microsoft.com/office/word/2016/wordml/cid" xmlns:w16="http://schemas.microsoft.com/office/word/2018/wordml" xmlns:w16sdtdh="http://schemas.microsoft.com/office/word/2020/wordml/sdtdatahash" xmlns:w16se="http://schemas.microsoft.com/office/word/2015/wordml/symex" mc:Ignorable="w14 w15 w16se w16cid w16 w16cex w16sdtdh">
+<w:styles xmlns:mc="http://schemas.openxmlformats.org/markup-compatibility/2006" xmlns:r="http://schemas.openxmlformats.org/officeDocument/2006/relationships" xmlns:w="http://schemas.openxmlformats.org/wordprocessingml/2006/main" xmlns:w14="http://schemas.microsoft.com/office/word/2010/wordml" xmlns:w15="http://schemas.microsoft.com/office/word/2012/wordml" xmlns:w16="http://schemas.microsoft.com/office/word/2018/wordml" xmlns:w16cex="http://schemas.microsoft.com/office/word/2018/wordml/cex" xmlns:w16cid="http://schemas.microsoft.com/office/word/2016/wordml/cid" xmlns:w16sdtdh="http://schemas.microsoft.com/office/word/2020/wordml/sdtdatahash" xmlns:w16se="http://schemas.microsoft.com/office/word/2015/wordml/symex" mc:Ignorable="w14 w15 w16se w16cid w16 w16cex w16sdtdh">
   <w:docDefaults>
     <w:rPrDefault>
       <w:rPr>
-        <w:rFonts w:asciiTheme="minorHAnsi" w:eastAsiaTheme="minorEastAsia" w:hAnsiTheme="minorHAnsi" w:cstheme="minorBidi"/>
+        <w:rFonts w:asciiTheme="minorHAnsi" w:cstheme="minorBidi" w:eastAsiaTheme="minorEastAsia" w:hAnsiTheme="minorHAnsi"/>
         <w:sz w:val="24"/>
         <w:szCs w:val="24"/>
-        <w:lang w:val="en-US" w:eastAsia="zh-CN" w:bidi="ar-SA"/>
+        <w:lang w:bidi="ar-SA" w:eastAsia="zh-CN" w:val="en-US"/>
       </w:rPr>
     </w:rPrDefault>
     <w:pPrDefault>
@@ -13443,7 +13415,7 @@
       </w:pPr>
     </w:pPrDefault>
   </w:docDefaults>
-  <w:latentStyles w:defLockedState="0" w:defUIPriority="0" w:defSemiHidden="0" w:defUnhideWhenUsed="0" w:defQFormat="0" w:count="376">
+  <w:latentStyles w:count="376" w:defLockedState="0" w:defQFormat="0" w:defSemiHidden="0" w:defUIPriority="0" w:defUnhideWhenUsed="0">
     <w:lsdException w:name="heading 5" w:semiHidden="1" w:unhideWhenUsed="1"/>
     <w:lsdException w:name="index 2" w:semiHidden="1" w:unhideWhenUsed="1"/>
     <w:lsdException w:name="index 3" w:semiHidden="1" w:unhideWhenUsed="1"/>
@@ -13781,18 +13753,18 @@
     <w:lsdException w:name="Unresolved Mention" w:semiHidden="1" w:uiPriority="99" w:unhideWhenUsed="1"/>
     <w:lsdException w:name="Smart Link" w:semiHidden="1" w:uiPriority="99" w:unhideWhenUsed="1"/>
   </w:latentStyles>
-  <w:style w:type="paragraph" w:default="1" w:styleId="Normal">
+  <w:style w:default="1" w:styleId="Normal" w:type="paragraph">
     <w:name w:val="Normal"/>
     <w:qFormat/>
     <w:pPr>
       <w:spacing w:after="60"/>
     </w:pPr>
     <w:rPr>
-      <w:rFonts w:ascii="Calibri" w:hAnsi="Calibri" w:cs="Calibri"/>
+      <w:rFonts w:ascii="Calibri" w:cs="Calibri" w:hAnsi="Calibri"/>
       <w:sz w:val="20"/>
     </w:rPr>
   </w:style>
-  <w:style w:type="paragraph" w:styleId="Titre1">
+  <w:style w:styleId="Titre1" w:type="paragraph">
     <w:name w:val="heading 1"/>
     <w:basedOn w:val="Normal"/>
     <w:next w:val="Corpsdetexte"/>
@@ -13803,17 +13775,17 @@
     <w:pPr>
       <w:keepNext/>
       <w:keepLines/>
-      <w:spacing w:before="360" w:after="80"/>
+      <w:spacing w:after="80" w:before="360"/>
       <w:outlineLvl w:val="0"/>
     </w:pPr>
     <w:rPr>
-      <w:rFonts w:asciiTheme="majorHAnsi" w:eastAsiaTheme="majorEastAsia" w:hAnsiTheme="majorHAnsi" w:cstheme="majorBidi"/>
-      <w:color w:val="0F4761" w:themeColor="accent1" w:themeShade="BF"/>
+      <w:rFonts w:asciiTheme="majorHAnsi" w:cstheme="majorBidi" w:eastAsiaTheme="majorEastAsia" w:hAnsiTheme="majorHAnsi"/>
+      <w:color w:themeColor="accent1" w:themeShade="BF" w:val="0F4761"/>
       <w:sz w:val="40"/>
       <w:szCs w:val="40"/>
     </w:rPr>
   </w:style>
-  <w:style w:type="paragraph" w:styleId="Titre2">
+  <w:style w:styleId="Titre2" w:type="paragraph">
     <w:name w:val="heading 2"/>
     <w:basedOn w:val="Normal"/>
     <w:next w:val="Corpsdetexte"/>
@@ -13826,17 +13798,17 @@
     <w:pPr>
       <w:keepNext/>
       <w:keepLines/>
-      <w:spacing w:before="160" w:after="80"/>
+      <w:spacing w:after="80" w:before="160"/>
       <w:outlineLvl w:val="1"/>
     </w:pPr>
     <w:rPr>
-      <w:rFonts w:asciiTheme="majorHAnsi" w:eastAsiaTheme="majorEastAsia" w:hAnsiTheme="majorHAnsi" w:cstheme="majorBidi"/>
-      <w:color w:val="0F4761" w:themeColor="accent1" w:themeShade="BF"/>
+      <w:rFonts w:asciiTheme="majorHAnsi" w:cstheme="majorBidi" w:eastAsiaTheme="majorEastAsia" w:hAnsiTheme="majorHAnsi"/>
+      <w:color w:themeColor="accent1" w:themeShade="BF" w:val="0F4761"/>
       <w:sz w:val="32"/>
       <w:szCs w:val="32"/>
     </w:rPr>
   </w:style>
-  <w:style w:type="paragraph" w:styleId="Titre3">
+  <w:style w:styleId="Titre3" w:type="paragraph">
     <w:name w:val="heading 3"/>
     <w:basedOn w:val="Normal"/>
     <w:next w:val="Corpsdetexte"/>
@@ -13849,17 +13821,17 @@
     <w:pPr>
       <w:keepNext/>
       <w:keepLines/>
-      <w:spacing w:before="160" w:after="80"/>
+      <w:spacing w:after="80" w:before="160"/>
       <w:outlineLvl w:val="2"/>
     </w:pPr>
     <w:rPr>
-      <w:rFonts w:eastAsiaTheme="majorEastAsia" w:cstheme="majorBidi"/>
-      <w:color w:val="0F4761" w:themeColor="accent1" w:themeShade="BF"/>
+      <w:rFonts w:cstheme="majorBidi" w:eastAsiaTheme="majorEastAsia"/>
+      <w:color w:themeColor="accent1" w:themeShade="BF" w:val="0F4761"/>
       <w:sz w:val="28"/>
       <w:szCs w:val="28"/>
     </w:rPr>
   </w:style>
-  <w:style w:type="paragraph" w:styleId="Titre4">
+  <w:style w:styleId="Titre4" w:type="paragraph">
     <w:name w:val="heading 4"/>
     <w:basedOn w:val="Normal"/>
     <w:next w:val="Corpsdetexte"/>
@@ -13872,17 +13844,17 @@
     <w:pPr>
       <w:keepNext/>
       <w:keepLines/>
-      <w:spacing w:before="80" w:after="40"/>
+      <w:spacing w:after="40" w:before="80"/>
       <w:outlineLvl w:val="3"/>
     </w:pPr>
     <w:rPr>
-      <w:rFonts w:eastAsiaTheme="majorEastAsia" w:cstheme="majorBidi"/>
+      <w:rFonts w:cstheme="majorBidi" w:eastAsiaTheme="majorEastAsia"/>
       <w:i/>
       <w:iCs/>
-      <w:color w:val="0F4761" w:themeColor="accent1" w:themeShade="BF"/>
+      <w:color w:themeColor="accent1" w:themeShade="BF" w:val="0F4761"/>
     </w:rPr>
   </w:style>
-  <w:style w:type="paragraph" w:styleId="Titre5">
+  <w:style w:styleId="Titre5" w:type="paragraph">
     <w:name w:val="heading 5"/>
     <w:basedOn w:val="Normal"/>
     <w:next w:val="Corpsdetexte"/>
@@ -13895,15 +13867,15 @@
     <w:pPr>
       <w:keepNext/>
       <w:keepLines/>
-      <w:spacing w:before="80" w:after="40"/>
+      <w:spacing w:after="40" w:before="80"/>
       <w:outlineLvl w:val="4"/>
     </w:pPr>
     <w:rPr>
-      <w:rFonts w:eastAsiaTheme="majorEastAsia" w:cstheme="majorBidi"/>
-      <w:color w:val="0F4761" w:themeColor="accent1" w:themeShade="BF"/>
+      <w:rFonts w:cstheme="majorBidi" w:eastAsiaTheme="majorEastAsia"/>
+      <w:color w:themeColor="accent1" w:themeShade="BF" w:val="0F4761"/>
     </w:rPr>
   </w:style>
-  <w:style w:type="paragraph" w:styleId="Titre6">
+  <w:style w:styleId="Titre6" w:type="paragraph">
     <w:name w:val="heading 6"/>
     <w:basedOn w:val="Normal"/>
     <w:next w:val="Corpsdetexte"/>
@@ -13916,17 +13888,17 @@
     <w:pPr>
       <w:keepNext/>
       <w:keepLines/>
-      <w:spacing w:before="40" w:after="0"/>
+      <w:spacing w:after="0" w:before="40"/>
       <w:outlineLvl w:val="5"/>
     </w:pPr>
     <w:rPr>
-      <w:rFonts w:eastAsiaTheme="majorEastAsia" w:cstheme="majorBidi"/>
+      <w:rFonts w:cstheme="majorBidi" w:eastAsiaTheme="majorEastAsia"/>
       <w:i/>
       <w:iCs/>
-      <w:color w:val="595959" w:themeColor="text1" w:themeTint="A6"/>
+      <w:color w:themeColor="text1" w:themeTint="A6" w:val="595959"/>
     </w:rPr>
   </w:style>
-  <w:style w:type="paragraph" w:styleId="Titre7">
+  <w:style w:styleId="Titre7" w:type="paragraph">
     <w:name w:val="heading 7"/>
     <w:basedOn w:val="Normal"/>
     <w:next w:val="Corpsdetexte"/>
@@ -13939,15 +13911,15 @@
     <w:pPr>
       <w:keepNext/>
       <w:keepLines/>
-      <w:spacing w:before="40" w:after="0"/>
+      <w:spacing w:after="0" w:before="40"/>
       <w:outlineLvl w:val="6"/>
     </w:pPr>
     <w:rPr>
-      <w:rFonts w:eastAsiaTheme="majorEastAsia" w:cstheme="majorBidi"/>
-      <w:color w:val="595959" w:themeColor="text1" w:themeTint="A6"/>
+      <w:rFonts w:cstheme="majorBidi" w:eastAsiaTheme="majorEastAsia"/>
+      <w:color w:themeColor="text1" w:themeTint="A6" w:val="595959"/>
     </w:rPr>
   </w:style>
-  <w:style w:type="paragraph" w:styleId="Titre8">
+  <w:style w:styleId="Titre8" w:type="paragraph">
     <w:name w:val="heading 8"/>
     <w:basedOn w:val="Normal"/>
     <w:next w:val="Corpsdetexte"/>
@@ -13964,13 +13936,13 @@
       <w:outlineLvl w:val="7"/>
     </w:pPr>
     <w:rPr>
-      <w:rFonts w:eastAsiaTheme="majorEastAsia" w:cstheme="majorBidi"/>
+      <w:rFonts w:cstheme="majorBidi" w:eastAsiaTheme="majorEastAsia"/>
       <w:i/>
       <w:iCs/>
-      <w:color w:val="272727" w:themeColor="text1" w:themeTint="D8"/>
+      <w:color w:themeColor="text1" w:themeTint="D8" w:val="272727"/>
     </w:rPr>
   </w:style>
-  <w:style w:type="paragraph" w:styleId="Titre9">
+  <w:style w:styleId="Titre9" w:type="paragraph">
     <w:name w:val="heading 9"/>
     <w:basedOn w:val="Normal"/>
     <w:next w:val="Corpsdetexte"/>
@@ -13987,63 +13959,63 @@
       <w:outlineLvl w:val="8"/>
     </w:pPr>
     <w:rPr>
-      <w:rFonts w:eastAsiaTheme="majorEastAsia" w:cstheme="majorBidi"/>
-      <w:color w:val="272727" w:themeColor="text1" w:themeTint="D8"/>
+      <w:rFonts w:cstheme="majorBidi" w:eastAsiaTheme="majorEastAsia"/>
+      <w:color w:themeColor="text1" w:themeTint="D8" w:val="272727"/>
     </w:rPr>
   </w:style>
-  <w:style w:type="character" w:default="1" w:styleId="Policepardfaut">
+  <w:style w:default="1" w:styleId="Policepardfaut" w:type="character">
     <w:name w:val="Default Paragraph Font"/>
     <w:uiPriority w:val="1"/>
     <w:semiHidden/>
     <w:unhideWhenUsed/>
   </w:style>
-  <w:style w:type="table" w:default="1" w:styleId="TableauNormal">
+  <w:style w:default="1" w:styleId="TableauNormal" w:type="table">
     <w:name w:val="Normal Table"/>
     <w:uiPriority w:val="99"/>
     <w:semiHidden/>
     <w:unhideWhenUsed/>
     <w:tblPr>
-      <w:tblInd w:w="0" w:type="dxa"/>
+      <w:tblInd w:type="dxa" w:w="0"/>
       <w:tblCellMar>
-        <w:top w:w="0" w:type="dxa"/>
-        <w:left w:w="108" w:type="dxa"/>
-        <w:bottom w:w="0" w:type="dxa"/>
-        <w:right w:w="108" w:type="dxa"/>
+        <w:top w:type="dxa" w:w="0"/>
+        <w:left w:type="dxa" w:w="108"/>
+        <w:bottom w:type="dxa" w:w="0"/>
+        <w:right w:type="dxa" w:w="108"/>
       </w:tblCellMar>
     </w:tblPr>
   </w:style>
-  <w:style w:type="numbering" w:default="1" w:styleId="Aucuneliste">
+  <w:style w:default="1" w:styleId="Aucuneliste" w:type="numbering">
     <w:name w:val="No List"/>
     <w:uiPriority w:val="99"/>
     <w:semiHidden/>
     <w:unhideWhenUsed/>
   </w:style>
-  <w:style w:type="paragraph" w:styleId="Corpsdetexte">
+  <w:style w:styleId="Corpsdetexte" w:type="paragraph">
     <w:name w:val="Body Text"/>
     <w:basedOn w:val="Normal"/>
     <w:qFormat/>
     <w:pPr>
-      <w:spacing w:before="180" w:after="180"/>
+      <w:spacing w:after="180" w:before="180"/>
     </w:pPr>
   </w:style>
-  <w:style w:type="paragraph" w:customStyle="1" w:styleId="FirstParagraph">
+  <w:style w:customStyle="1" w:styleId="FirstParagraph" w:type="paragraph">
     <w:name w:val="First Paragraph"/>
     <w:basedOn w:val="Corpsdetexte"/>
     <w:next w:val="Corpsdetexte"/>
     <w:qFormat/>
     <w:pPr>
-      <w:spacing w:before="0" w:after="60"/>
+      <w:spacing w:after="60" w:before="0"/>
     </w:pPr>
   </w:style>
-  <w:style w:type="paragraph" w:customStyle="1" w:styleId="Compact">
+  <w:style w:customStyle="1" w:styleId="Compact" w:type="paragraph">
     <w:name w:val="Compact"/>
     <w:basedOn w:val="Corpsdetexte"/>
     <w:qFormat/>
     <w:pPr>
-      <w:spacing w:before="0" w:after="60"/>
+      <w:spacing w:after="60" w:before="0"/>
     </w:pPr>
   </w:style>
-  <w:style w:type="paragraph" w:styleId="Titre">
+  <w:style w:styleId="Titre" w:type="paragraph">
     <w:name w:val="Title"/>
     <w:basedOn w:val="Normal"/>
     <w:next w:val="Corpsdetexte"/>
@@ -14057,24 +14029,24 @@
       <w:jc w:val="center"/>
     </w:pPr>
     <w:rPr>
-      <w:rFonts w:asciiTheme="majorHAnsi" w:eastAsiaTheme="majorEastAsia" w:hAnsiTheme="majorHAnsi" w:cstheme="majorBidi"/>
+      <w:rFonts w:asciiTheme="majorHAnsi" w:cstheme="majorBidi" w:eastAsiaTheme="majorEastAsia" w:hAnsiTheme="majorHAnsi"/>
       <w:sz w:val="56"/>
       <w:szCs w:val="56"/>
     </w:rPr>
   </w:style>
-  <w:style w:type="character" w:customStyle="1" w:styleId="TitreCar">
+  <w:style w:customStyle="1" w:styleId="TitreCar" w:type="character">
     <w:name w:val="Titre Car"/>
     <w:basedOn w:val="Policepardfaut"/>
     <w:link w:val="Titre"/>
     <w:uiPriority w:val="10"/>
     <w:rsid w:val="00A10FD9"/>
     <w:rPr>
-      <w:rFonts w:asciiTheme="majorHAnsi" w:eastAsiaTheme="majorEastAsia" w:hAnsiTheme="majorHAnsi" w:cstheme="majorBidi"/>
+      <w:rFonts w:asciiTheme="majorHAnsi" w:cstheme="majorBidi" w:eastAsiaTheme="majorEastAsia" w:hAnsiTheme="majorHAnsi"/>
       <w:sz w:val="56"/>
       <w:szCs w:val="56"/>
     </w:rPr>
   </w:style>
-  <w:style w:type="paragraph" w:styleId="Sous-titre">
+  <w:style w:styleId="Sous-titre" w:type="paragraph">
     <w:name w:val="Subtitle"/>
     <w:basedOn w:val="Titre"/>
     <w:next w:val="Corpsdetexte"/>
@@ -14093,21 +14065,21 @@
       <w:szCs w:val="28"/>
     </w:rPr>
   </w:style>
-  <w:style w:type="character" w:customStyle="1" w:styleId="Sous-titreCar">
+  <w:style w:customStyle="1" w:styleId="Sous-titreCar" w:type="character">
     <w:name w:val="Sous-titre Car"/>
     <w:basedOn w:val="Policepardfaut"/>
     <w:link w:val="Sous-titre"/>
     <w:uiPriority w:val="11"/>
     <w:rsid w:val="00A10FD9"/>
     <w:rPr>
-      <w:rFonts w:eastAsiaTheme="majorEastAsia" w:cstheme="majorBidi"/>
-      <w:color w:val="595959" w:themeColor="text1" w:themeTint="A6"/>
+      <w:rFonts w:cstheme="majorBidi" w:eastAsiaTheme="majorEastAsia"/>
+      <w:color w:themeColor="text1" w:themeTint="A6" w:val="595959"/>
       <w:spacing w:val="15"/>
       <w:sz w:val="28"/>
       <w:szCs w:val="28"/>
     </w:rPr>
   </w:style>
-  <w:style w:type="paragraph" w:customStyle="1" w:styleId="Author">
+  <w:style w:customStyle="1" w:styleId="Author" w:type="paragraph">
     <w:name w:val="Author"/>
     <w:basedOn w:val="Titre"/>
     <w:next w:val="Corpsdetexte"/>
@@ -14121,7 +14093,7 @@
       <w:szCs w:val="24"/>
     </w:rPr>
   </w:style>
-  <w:style w:type="paragraph" w:styleId="Date">
+  <w:style w:styleId="Date" w:type="paragraph">
     <w:name w:val="Date"/>
     <w:basedOn w:val="Titre"/>
     <w:next w:val="Corpsdetexte"/>
@@ -14135,7 +14107,7 @@
       <w:szCs w:val="24"/>
     </w:rPr>
   </w:style>
-  <w:style w:type="paragraph" w:customStyle="1" w:styleId="AbstractTitle">
+  <w:style w:customStyle="1" w:styleId="AbstractTitle" w:type="paragraph">
     <w:name w:val="Abstract Title"/>
     <w:basedOn w:val="Normal"/>
     <w:next w:val="Abstract"/>
@@ -14143,7 +14115,7 @@
     <w:pPr>
       <w:keepNext/>
       <w:keepLines/>
-      <w:spacing w:before="300" w:after="0"/>
+      <w:spacing w:after="0" w:before="300"/>
       <w:jc w:val="center"/>
     </w:pPr>
     <w:rPr>
@@ -14151,7 +14123,7 @@
       <w:szCs w:val="20"/>
     </w:rPr>
   </w:style>
-  <w:style w:type="paragraph" w:customStyle="1" w:styleId="Abstract">
+  <w:style w:customStyle="1" w:styleId="Abstract" w:type="paragraph">
     <w:name w:val="Abstract"/>
     <w:basedOn w:val="Normal"/>
     <w:next w:val="Corpsdetexte"/>
@@ -14159,31 +14131,31 @@
     <w:pPr>
       <w:keepNext/>
       <w:keepLines/>
-      <w:spacing w:before="100" w:after="300"/>
+      <w:spacing w:after="300" w:before="100"/>
     </w:pPr>
     <w:rPr>
       <w:szCs w:val="20"/>
     </w:rPr>
   </w:style>
-  <w:style w:type="paragraph" w:styleId="Bibliographie">
+  <w:style w:styleId="Bibliographie" w:type="paragraph">
     <w:name w:val="Bibliography"/>
     <w:basedOn w:val="Normal"/>
     <w:qFormat/>
   </w:style>
-  <w:style w:type="character" w:customStyle="1" w:styleId="Titre1Car">
+  <w:style w:customStyle="1" w:styleId="Titre1Car" w:type="character">
     <w:name w:val="Titre 1 Car"/>
     <w:basedOn w:val="Policepardfaut"/>
     <w:link w:val="Titre1"/>
     <w:uiPriority w:val="9"/>
     <w:rsid w:val="00A10FD9"/>
     <w:rPr>
-      <w:rFonts w:asciiTheme="majorHAnsi" w:eastAsiaTheme="majorEastAsia" w:hAnsiTheme="majorHAnsi" w:cstheme="majorBidi"/>
-      <w:color w:val="0F4761" w:themeColor="accent1" w:themeShade="BF"/>
+      <w:rFonts w:asciiTheme="majorHAnsi" w:cstheme="majorBidi" w:eastAsiaTheme="majorEastAsia" w:hAnsiTheme="majorHAnsi"/>
+      <w:color w:themeColor="accent1" w:themeShade="BF" w:val="0F4761"/>
       <w:sz w:val="40"/>
       <w:szCs w:val="40"/>
     </w:rPr>
   </w:style>
-  <w:style w:type="character" w:customStyle="1" w:styleId="Titre2Car">
+  <w:style w:customStyle="1" w:styleId="Titre2Car" w:type="character">
     <w:name w:val="Titre 2 Car"/>
     <w:basedOn w:val="Policepardfaut"/>
     <w:link w:val="Titre2"/>
@@ -14191,13 +14163,13 @@
     <w:semiHidden/>
     <w:rsid w:val="00A10FD9"/>
     <w:rPr>
-      <w:rFonts w:asciiTheme="majorHAnsi" w:eastAsiaTheme="majorEastAsia" w:hAnsiTheme="majorHAnsi" w:cstheme="majorBidi"/>
-      <w:color w:val="0F4761" w:themeColor="accent1" w:themeShade="BF"/>
+      <w:rFonts w:asciiTheme="majorHAnsi" w:cstheme="majorBidi" w:eastAsiaTheme="majorEastAsia" w:hAnsiTheme="majorHAnsi"/>
+      <w:color w:themeColor="accent1" w:themeShade="BF" w:val="0F4761"/>
       <w:sz w:val="32"/>
       <w:szCs w:val="32"/>
     </w:rPr>
   </w:style>
-  <w:style w:type="character" w:customStyle="1" w:styleId="Titre3Car">
+  <w:style w:customStyle="1" w:styleId="Titre3Car" w:type="character">
     <w:name w:val="Titre 3 Car"/>
     <w:basedOn w:val="Policepardfaut"/>
     <w:link w:val="Titre3"/>
@@ -14205,13 +14177,13 @@
     <w:semiHidden/>
     <w:rsid w:val="00A10FD9"/>
     <w:rPr>
-      <w:rFonts w:eastAsiaTheme="majorEastAsia" w:cstheme="majorBidi"/>
-      <w:color w:val="0F4761" w:themeColor="accent1" w:themeShade="BF"/>
+      <w:rFonts w:cstheme="majorBidi" w:eastAsiaTheme="majorEastAsia"/>
+      <w:color w:themeColor="accent1" w:themeShade="BF" w:val="0F4761"/>
       <w:sz w:val="28"/>
       <w:szCs w:val="28"/>
     </w:rPr>
   </w:style>
-  <w:style w:type="character" w:customStyle="1" w:styleId="Titre4Car">
+  <w:style w:customStyle="1" w:styleId="Titre4Car" w:type="character">
     <w:name w:val="Titre 4 Car"/>
     <w:basedOn w:val="Policepardfaut"/>
     <w:link w:val="Titre4"/>
@@ -14219,13 +14191,13 @@
     <w:semiHidden/>
     <w:rsid w:val="00A10FD9"/>
     <w:rPr>
-      <w:rFonts w:eastAsiaTheme="majorEastAsia" w:cstheme="majorBidi"/>
+      <w:rFonts w:cstheme="majorBidi" w:eastAsiaTheme="majorEastAsia"/>
       <w:i/>
       <w:iCs/>
-      <w:color w:val="0F4761" w:themeColor="accent1" w:themeShade="BF"/>
+      <w:color w:themeColor="accent1" w:themeShade="BF" w:val="0F4761"/>
     </w:rPr>
   </w:style>
-  <w:style w:type="character" w:customStyle="1" w:styleId="Titre5Car">
+  <w:style w:customStyle="1" w:styleId="Titre5Car" w:type="character">
     <w:name w:val="Titre 5 Car"/>
     <w:basedOn w:val="Policepardfaut"/>
     <w:link w:val="Titre5"/>
@@ -14233,11 +14205,11 @@
     <w:semiHidden/>
     <w:rsid w:val="00A10FD9"/>
     <w:rPr>
-      <w:rFonts w:eastAsiaTheme="majorEastAsia" w:cstheme="majorBidi"/>
-      <w:color w:val="0F4761" w:themeColor="accent1" w:themeShade="BF"/>
+      <w:rFonts w:cstheme="majorBidi" w:eastAsiaTheme="majorEastAsia"/>
+      <w:color w:themeColor="accent1" w:themeShade="BF" w:val="0F4761"/>
     </w:rPr>
   </w:style>
-  <w:style w:type="character" w:customStyle="1" w:styleId="Titre6Car">
+  <w:style w:customStyle="1" w:styleId="Titre6Car" w:type="character">
     <w:name w:val="Titre 6 Car"/>
     <w:basedOn w:val="Policepardfaut"/>
     <w:link w:val="Titre6"/>
@@ -14245,13 +14217,13 @@
     <w:semiHidden/>
     <w:rsid w:val="00A10FD9"/>
     <w:rPr>
-      <w:rFonts w:eastAsiaTheme="majorEastAsia" w:cstheme="majorBidi"/>
+      <w:rFonts w:cstheme="majorBidi" w:eastAsiaTheme="majorEastAsia"/>
       <w:i/>
       <w:iCs/>
-      <w:color w:val="595959" w:themeColor="text1" w:themeTint="A6"/>
+      <w:color w:themeColor="text1" w:themeTint="A6" w:val="595959"/>
     </w:rPr>
   </w:style>
-  <w:style w:type="character" w:customStyle="1" w:styleId="Titre7Car">
+  <w:style w:customStyle="1" w:styleId="Titre7Car" w:type="character">
     <w:name w:val="Titre 7 Car"/>
     <w:basedOn w:val="Policepardfaut"/>
     <w:link w:val="Titre7"/>
@@ -14259,11 +14231,11 @@
     <w:semiHidden/>
     <w:rsid w:val="00A10FD9"/>
     <w:rPr>
-      <w:rFonts w:eastAsiaTheme="majorEastAsia" w:cstheme="majorBidi"/>
-      <w:color w:val="595959" w:themeColor="text1" w:themeTint="A6"/>
+      <w:rFonts w:cstheme="majorBidi" w:eastAsiaTheme="majorEastAsia"/>
+      <w:color w:themeColor="text1" w:themeTint="A6" w:val="595959"/>
     </w:rPr>
   </w:style>
-  <w:style w:type="character" w:customStyle="1" w:styleId="Titre8Car">
+  <w:style w:customStyle="1" w:styleId="Titre8Car" w:type="character">
     <w:name w:val="Titre 8 Car"/>
     <w:basedOn w:val="Policepardfaut"/>
     <w:link w:val="Titre8"/>
@@ -14271,13 +14243,13 @@
     <w:semiHidden/>
     <w:rsid w:val="00A10FD9"/>
     <w:rPr>
-      <w:rFonts w:eastAsiaTheme="majorEastAsia" w:cstheme="majorBidi"/>
+      <w:rFonts w:cstheme="majorBidi" w:eastAsiaTheme="majorEastAsia"/>
       <w:i/>
       <w:iCs/>
-      <w:color w:val="272727" w:themeColor="text1" w:themeTint="D8"/>
+      <w:color w:themeColor="text1" w:themeTint="D8" w:val="272727"/>
     </w:rPr>
   </w:style>
-  <w:style w:type="character" w:customStyle="1" w:styleId="Titre9Car">
+  <w:style w:customStyle="1" w:styleId="Titre9Car" w:type="character">
     <w:name w:val="Titre 9 Car"/>
     <w:basedOn w:val="Policepardfaut"/>
     <w:link w:val="Titre9"/>
@@ -14285,11 +14257,11 @@
     <w:semiHidden/>
     <w:rsid w:val="00A10FD9"/>
     <w:rPr>
-      <w:rFonts w:eastAsiaTheme="majorEastAsia" w:cstheme="majorBidi"/>
-      <w:color w:val="272727" w:themeColor="text1" w:themeTint="D8"/>
+      <w:rFonts w:cstheme="majorBidi" w:eastAsiaTheme="majorEastAsia"/>
+      <w:color w:themeColor="text1" w:themeTint="D8" w:val="272727"/>
     </w:rPr>
   </w:style>
-  <w:style w:type="paragraph" w:styleId="Normalcentr">
+  <w:style w:styleId="Normalcentr" w:type="paragraph">
     <w:name w:val="Block Text"/>
     <w:basedOn w:val="Corpsdetexte"/>
     <w:next w:val="Corpsdetexte"/>
@@ -14297,18 +14269,18 @@
     <w:unhideWhenUsed/>
     <w:qFormat/>
     <w:pPr>
-      <w:spacing w:before="100" w:after="100"/>
+      <w:spacing w:after="100" w:before="100"/>
       <w:ind w:left="480" w:right="480"/>
     </w:pPr>
   </w:style>
-  <w:style w:type="paragraph" w:styleId="Notedebasdepage">
+  <w:style w:styleId="Notedebasdepage" w:type="paragraph">
     <w:name w:val="footnote text"/>
     <w:basedOn w:val="Normal"/>
     <w:uiPriority w:val="9"/>
     <w:unhideWhenUsed/>
     <w:qFormat/>
   </w:style>
-  <w:style w:type="paragraph" w:customStyle="1" w:styleId="FootnoteBlockText">
+  <w:style w:customStyle="1" w:styleId="FootnoteBlockText" w:type="paragraph">
     <w:name w:val="Footnote Block Text"/>
     <w:basedOn w:val="Notedebasdepage"/>
     <w:next w:val="Notedebasdepage"/>
@@ -14316,38 +14288,38 @@
     <w:unhideWhenUsed/>
     <w:qFormat/>
     <w:pPr>
-      <w:spacing w:before="100" w:after="100"/>
+      <w:spacing w:after="100" w:before="100"/>
       <w:ind w:left="480" w:right="480"/>
     </w:pPr>
   </w:style>
-  <w:style w:type="table" w:customStyle="1" w:styleId="Table">
+  <w:style w:customStyle="1" w:styleId="Table" w:type="table">
     <w:name w:val="Table"/>
     <w:qFormat/>
     <w:rPr>
       <w:sz w:val="17"/>
       <w:szCs w:val="20"/>
-      <w:lang w:val="fr-BF" w:eastAsia="fr-BF"/>
+      <w:lang w:eastAsia="fr-BF" w:val="fr-BF"/>
     </w:rPr>
     <w:tblPr>
-      <w:tblInd w:w="0" w:type="dxa"/>
+      <w:tblInd w:type="dxa" w:w="0"/>
       <w:tblCellMar>
-        <w:top w:w="0" w:type="dxa"/>
-        <w:left w:w="108" w:type="dxa"/>
-        <w:bottom w:w="0" w:type="dxa"/>
-        <w:right w:w="108" w:type="dxa"/>
+        <w:top w:type="dxa" w:w="0"/>
+        <w:left w:type="dxa" w:w="108"/>
+        <w:bottom w:type="dxa" w:w="0"/>
+        <w:right w:type="dxa" w:w="108"/>
       </w:tblCellMar>
     </w:tblPr>
     <w:tblStylePr w:type="firstRow">
       <w:tblPr/>
       <w:tcPr>
         <w:tcBorders>
-          <w:bottom w:val="single" w:sz="0" w:space="0" w:color="auto"/>
+          <w:bottom w:color="auto" w:space="0" w:sz="0" w:val="single"/>
         </w:tcBorders>
         <w:vAlign w:val="bottom"/>
       </w:tcPr>
     </w:tblStylePr>
   </w:style>
-  <w:style w:type="paragraph" w:customStyle="1" w:styleId="DefinitionTerm">
+  <w:style w:customStyle="1" w:styleId="DefinitionTerm" w:type="paragraph">
     <w:name w:val="Definition Term"/>
     <w:basedOn w:val="Normal"/>
     <w:next w:val="Definition"/>
@@ -14360,11 +14332,11 @@
       <w:b/>
     </w:rPr>
   </w:style>
-  <w:style w:type="paragraph" w:customStyle="1" w:styleId="Definition">
+  <w:style w:customStyle="1" w:styleId="Definition" w:type="paragraph">
     <w:name w:val="Definition"/>
     <w:basedOn w:val="Normal"/>
   </w:style>
-  <w:style w:type="paragraph" w:styleId="Lgende">
+  <w:style w:styleId="Lgende" w:type="paragraph">
     <w:name w:val="caption"/>
     <w:basedOn w:val="Normal"/>
     <w:link w:val="LgendeCar"/>
@@ -14375,34 +14347,34 @@
       <w:i/>
     </w:rPr>
   </w:style>
-  <w:style w:type="paragraph" w:customStyle="1" w:styleId="TableCaption">
+  <w:style w:customStyle="1" w:styleId="TableCaption" w:type="paragraph">
     <w:name w:val="Table Caption"/>
     <w:basedOn w:val="Lgende"/>
     <w:pPr>
       <w:keepNext/>
     </w:pPr>
   </w:style>
-  <w:style w:type="paragraph" w:customStyle="1" w:styleId="ImageCaption">
+  <w:style w:customStyle="1" w:styleId="ImageCaption" w:type="paragraph">
     <w:name w:val="Image Caption"/>
     <w:basedOn w:val="Lgende"/>
   </w:style>
-  <w:style w:type="paragraph" w:customStyle="1" w:styleId="Figure">
+  <w:style w:customStyle="1" w:styleId="Figure" w:type="paragraph">
     <w:name w:val="Figure"/>
     <w:basedOn w:val="Normal"/>
   </w:style>
-  <w:style w:type="paragraph" w:customStyle="1" w:styleId="CaptionedFigure">
+  <w:style w:customStyle="1" w:styleId="CaptionedFigure" w:type="paragraph">
     <w:name w:val="Captioned Figure"/>
     <w:basedOn w:val="Figure"/>
     <w:pPr>
       <w:keepNext/>
     </w:pPr>
   </w:style>
-  <w:style w:type="character" w:customStyle="1" w:styleId="LgendeCar">
+  <w:style w:customStyle="1" w:styleId="LgendeCar" w:type="character">
     <w:name w:val="Légende Car"/>
     <w:basedOn w:val="Policepardfaut"/>
     <w:link w:val="Lgende"/>
   </w:style>
-  <w:style w:type="character" w:customStyle="1" w:styleId="VerbatimChar">
+  <w:style w:customStyle="1" w:styleId="VerbatimChar" w:type="character">
     <w:name w:val="Verbatim Char"/>
     <w:basedOn w:val="LgendeCar"/>
     <w:rPr>
@@ -14410,25 +14382,25 @@
       <w:sz w:val="16"/>
     </w:rPr>
   </w:style>
-  <w:style w:type="character" w:customStyle="1" w:styleId="SectionNumber">
+  <w:style w:customStyle="1" w:styleId="SectionNumber" w:type="character">
     <w:name w:val="Section Number"/>
     <w:basedOn w:val="LgendeCar"/>
   </w:style>
-  <w:style w:type="character" w:styleId="Appelnotedebasdep">
+  <w:style w:styleId="Appelnotedebasdep" w:type="character">
     <w:name w:val="footnote reference"/>
     <w:basedOn w:val="LgendeCar"/>
     <w:rPr>
       <w:vertAlign w:val="superscript"/>
     </w:rPr>
   </w:style>
-  <w:style w:type="character" w:styleId="Lienhypertexte">
+  <w:style w:styleId="Lienhypertexte" w:type="character">
     <w:name w:val="Hyperlink"/>
     <w:basedOn w:val="LgendeCar"/>
     <w:rPr>
-      <w:color w:val="156082" w:themeColor="accent1"/>
+      <w:color w:themeColor="accent1" w:val="156082"/>
     </w:rPr>
   </w:style>
-  <w:style w:type="paragraph" w:styleId="En-ttedetabledesmatires">
+  <w:style w:styleId="En-ttedetabledesmatires" w:type="paragraph">
     <w:name w:val="TOC Heading"/>
     <w:basedOn w:val="Titre1"/>
     <w:next w:val="Corpsdetexte"/>

</xml_diff>

<commit_message>
Rotation d'OUEDRAOGO intégrée : vérification R5 mesurée sur le poste de PORGO
- tests/verifier_replication.sh rejoué : ligne lue sur bdd2 dès la 1re
  lecture, ligne de test supprimée ; résultat brut ajouté
- dossier (§ 6), tests/README, journal et suivi mis à jour ; Word et PDF
  régénérés (dossier 15 pages, journal 2 pages)
</commit_message>
<xml_diff>
--- a/docs/dossier_architecture.docx
+++ b/docs/dossier_architecture.docx
@@ -11650,6 +11650,89 @@
                 <w:rStyle w:val="VerbatimChar"/>
               </w:rPr>
               <w:t xml:space="preserve">repartition_20261023_104215.log</w:t>
+            </w:r>
+          </w:p>
+        </w:tc>
+      </w:tr>
+      <w:tr>
+        <w:tc>
+          <w:tcPr/>
+          <w:p>
+            <w:pPr>
+              <w:pStyle w:val="Compact"/>
+            </w:pPr>
+            <w:r>
+              <w:t xml:space="preserve">R5</w:t>
+            </w:r>
+          </w:p>
+        </w:tc>
+        <w:tc>
+          <w:tcPr/>
+          <w:p>
+            <w:pPr>
+              <w:pStyle w:val="Compact"/>
+            </w:pPr>
+            <w:r>
+              <w:rPr>
+                <w:rStyle w:val="VerbatimChar"/>
+              </w:rPr>
+              <w:t xml:space="preserve">bash tests/verifier_replication.sh</w:t>
+            </w:r>
+            <w:r>
+              <w:t xml:space="preserve"> </w:t>
+            </w:r>
+            <w:r>
+              <w:t xml:space="preserve">(OUEDRAOGO) : insertion d’une ligne datée sur bdd1, lecture sur bdd2, suppression</w:t>
+            </w:r>
+          </w:p>
+        </w:tc>
+        <w:tc>
+          <w:tcPr/>
+          <w:p>
+            <w:pPr>
+              <w:pStyle w:val="Compact"/>
+            </w:pPr>
+            <w:r>
+              <w:t xml:space="preserve">ligne lue sur bdd2</w:t>
+            </w:r>
+            <w:r>
+              <w:t xml:space="preserve"> </w:t>
+            </w:r>
+            <w:r>
+              <w:rPr>
+                <w:b/>
+                <w:bCs/>
+              </w:rPr>
+              <w:t xml:space="preserve">dès la 1re lecture (≤ 1 s)</w:t>
+            </w:r>
+            <w:r>
+              <w:t xml:space="preserve">, sur le poste d’OUEDRAOGO puis sur celui de PORGO ; ligne de test supprimée</w:t>
+            </w:r>
+          </w:p>
+        </w:tc>
+        <w:tc>
+          <w:tcPr/>
+          <w:p>
+            <w:pPr>
+              <w:pStyle w:val="Compact"/>
+            </w:pPr>
+            <w:r>
+              <w:rPr>
+                <w:rStyle w:val="VerbatimChar"/>
+              </w:rPr>
+              <w:t xml:space="preserve">r5_replication_20261025.log</w:t>
+            </w:r>
+            <w:r>
+              <w:t xml:space="preserve">,</w:t>
+            </w:r>
+            <w:r>
+              <w:t xml:space="preserve"> </w:t>
+            </w:r>
+            <w:r>
+              <w:rPr>
+                <w:rStyle w:val="VerbatimChar"/>
+              </w:rPr>
+              <w:t xml:space="preserve">r5_replication_20261025_141141_poste_porgo.log</w:t>
             </w:r>
           </w:p>
         </w:tc>

</xml_diff>